<commit_message>
adding more exercises module 07
</commit_message>
<xml_diff>
--- a/subjects/subject_words/java07_es_subject.docx
+++ b/subjects/subject_words/java07_es_subject.docx
@@ -430,7 +430,7 @@
           </mc:Choice>
           <mc:Fallback>
             <w:pict>
-              <v:shape w14:anchorId="009EA011" id="Graphic 3" o:spid="_x0000_s1026" style="position:absolute;margin-left:86.45pt;margin-top:20.05pt;width:476.5pt;height:25.2pt;z-index:-251656704;visibility:visible;mso-wrap-style:square;mso-wrap-distance-left:0;mso-wrap-distance-top:0;mso-wrap-distance-right:0;mso-wrap-distance-bottom:0;mso-position-horizontal:absolute;mso-position-horizontal-relative:page;mso-position-vertical:absolute;mso-position-vertical-relative:text;v-text-anchor:top" coordsize="6051550,320040" o:gfxdata="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" path="m6051397,l5594197,,,12,,18605r5594197,l5594197,320040r457200,l6051397,xe" fillcolor="black" stroked="f">
+              <v:shape w14:anchorId="333BE2A8" id="Graphic 3" o:spid="_x0000_s1026" style="position:absolute;margin-left:86.45pt;margin-top:20.05pt;width:476.5pt;height:25.2pt;z-index:-251656704;visibility:visible;mso-wrap-style:square;mso-wrap-distance-left:0;mso-wrap-distance-top:0;mso-wrap-distance-right:0;mso-wrap-distance-bottom:0;mso-position-horizontal:absolute;mso-position-horizontal-relative:page;mso-position-vertical:absolute;mso-position-vertical-relative:text;v-text-anchor:top" coordsize="6051550,320040" o:gfxdata="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" path="m6051397,l5594197,,,12,,18605r5594197,l5594197,320040r457200,l6051397,xe" fillcolor="black" stroked="f">
                 <v:path arrowok="t"/>
                 <w10:wrap type="topAndBottom" anchorx="page"/>
               </v:shape>
@@ -456,7 +456,7 @@
         </w:sectPr>
       </w:pPr>
     </w:p>
-    <w:bookmarkStart w:id="0" w:name="_Toc236757128" w:displacedByCustomXml="next"/>
+    <w:bookmarkStart w:id="0" w:name="_Toc236999175" w:displacedByCustomXml="next"/>
     <w:sdt>
       <w:sdtPr>
         <w:rPr>
@@ -515,7 +515,7 @@
           <w:r>
             <w:fldChar w:fldCharType="separate"/>
           </w:r>
-          <w:hyperlink w:anchor="_Toc236757128" w:history="1">
+          <w:hyperlink w:anchor="_Toc236999175" w:history="1">
             <w:r>
               <w:rPr>
                 <w:rStyle w:val="Hipervnculo"/>
@@ -542,7 +542,7 @@
                 <w:noProof/>
                 <w:webHidden/>
               </w:rPr>
-              <w:instrText xml:space="preserve"> PAGEREF _Toc236757128 \h </w:instrText>
+              <w:instrText xml:space="preserve"> PAGEREF _Toc236999175 \h </w:instrText>
             </w:r>
             <w:r>
               <w:rPr>
@@ -588,7 +588,7 @@
               <w14:ligatures w14:val="standardContextual"/>
             </w:rPr>
           </w:pPr>
-          <w:hyperlink w:anchor="_Toc236757129" w:history="1">
+          <w:hyperlink w:anchor="_Toc236999176" w:history="1">
             <w:r>
               <w:rPr>
                 <w:rStyle w:val="Hipervnculo"/>
@@ -632,7 +632,7 @@
                 <w:noProof/>
                 <w:webHidden/>
               </w:rPr>
-              <w:instrText xml:space="preserve"> PAGEREF _Toc236757129 \h </w:instrText>
+              <w:instrText xml:space="preserve"> PAGEREF _Toc236999176 \h </w:instrText>
             </w:r>
             <w:r>
               <w:rPr>
@@ -678,7 +678,7 @@
               <w14:ligatures w14:val="standardContextual"/>
             </w:rPr>
           </w:pPr>
-          <w:hyperlink w:anchor="_Toc236757130" w:history="1">
+          <w:hyperlink w:anchor="_Toc236999177" w:history="1">
             <w:r>
               <w:rPr>
                 <w:rStyle w:val="Hipervnculo"/>
@@ -722,7 +722,7 @@
                 <w:noProof/>
                 <w:webHidden/>
               </w:rPr>
-              <w:instrText xml:space="preserve"> PAGEREF _Toc236757130 \h </w:instrText>
+              <w:instrText xml:space="preserve"> PAGEREF _Toc236999177 \h </w:instrText>
             </w:r>
             <w:r>
               <w:rPr>
@@ -768,7 +768,7 @@
               <w14:ligatures w14:val="standardContextual"/>
             </w:rPr>
           </w:pPr>
-          <w:hyperlink w:anchor="_Toc236757131" w:history="1">
+          <w:hyperlink w:anchor="_Toc236999178" w:history="1">
             <w:r>
               <w:rPr>
                 <w:rStyle w:val="Hipervnculo"/>
@@ -812,7 +812,7 @@
                 <w:noProof/>
                 <w:webHidden/>
               </w:rPr>
-              <w:instrText xml:space="preserve"> PAGEREF _Toc236757131 \h </w:instrText>
+              <w:instrText xml:space="preserve"> PAGEREF _Toc236999178 \h </w:instrText>
             </w:r>
             <w:r>
               <w:rPr>
@@ -858,7 +858,7 @@
               <w14:ligatures w14:val="standardContextual"/>
             </w:rPr>
           </w:pPr>
-          <w:hyperlink w:anchor="_Toc236757132" w:history="1">
+          <w:hyperlink w:anchor="_Toc236999179" w:history="1">
             <w:r>
               <w:rPr>
                 <w:rStyle w:val="Hipervnculo"/>
@@ -937,7 +937,7 @@
                 <w:noProof/>
                 <w:webHidden/>
               </w:rPr>
-              <w:instrText xml:space="preserve"> PAGEREF _Toc236757132 \h </w:instrText>
+              <w:instrText xml:space="preserve"> PAGEREF _Toc236999179 \h </w:instrText>
             </w:r>
             <w:r>
               <w:rPr>
@@ -983,7 +983,7 @@
               <w14:ligatures w14:val="standardContextual"/>
             </w:rPr>
           </w:pPr>
-          <w:hyperlink w:anchor="_Toc236757133" w:history="1">
+          <w:hyperlink w:anchor="_Toc236999180" w:history="1">
             <w:r>
               <w:rPr>
                 <w:rStyle w:val="Hipervnculo"/>
@@ -1054,7 +1054,7 @@
                 <w:noProof/>
                 <w:webHidden/>
               </w:rPr>
-              <w:instrText xml:space="preserve"> PAGEREF _Toc236757133 \h </w:instrText>
+              <w:instrText xml:space="preserve"> PAGEREF _Toc236999180 \h </w:instrText>
             </w:r>
             <w:r>
               <w:rPr>
@@ -1100,7 +1100,7 @@
               <w14:ligatures w14:val="standardContextual"/>
             </w:rPr>
           </w:pPr>
-          <w:hyperlink w:anchor="_Toc236757134" w:history="1">
+          <w:hyperlink w:anchor="_Toc236999181" w:history="1">
             <w:r>
               <w:rPr>
                 <w:rStyle w:val="Hipervnculo"/>
@@ -1190,7 +1190,7 @@
                 <w:noProof/>
                 <w:webHidden/>
               </w:rPr>
-              <w:instrText xml:space="preserve"> PAGEREF _Toc236757134 \h </w:instrText>
+              <w:instrText xml:space="preserve"> PAGEREF _Toc236999181 \h </w:instrText>
             </w:r>
             <w:r>
               <w:rPr>
@@ -1236,7 +1236,7 @@
               <w14:ligatures w14:val="standardContextual"/>
             </w:rPr>
           </w:pPr>
-          <w:hyperlink w:anchor="_Toc236757135" w:history="1">
+          <w:hyperlink w:anchor="_Toc236999182" w:history="1">
             <w:r>
               <w:rPr>
                 <w:rStyle w:val="Hipervnculo"/>
@@ -1315,7 +1315,7 @@
                 <w:noProof/>
                 <w:webHidden/>
               </w:rPr>
-              <w:instrText xml:space="preserve"> PAGEREF _Toc236757135 \h </w:instrText>
+              <w:instrText xml:space="preserve"> PAGEREF _Toc236999182 \h </w:instrText>
             </w:r>
             <w:r>
               <w:rPr>
@@ -1361,7 +1361,7 @@
               <w14:ligatures w14:val="standardContextual"/>
             </w:rPr>
           </w:pPr>
-          <w:hyperlink w:anchor="_Toc236757136" w:history="1">
+          <w:hyperlink w:anchor="_Toc236999183" w:history="1">
             <w:r>
               <w:rPr>
                 <w:rStyle w:val="Hipervnculo"/>
@@ -1416,7 +1416,7 @@
                 <w:w w:val="90"/>
                 <w:highlight w:val="yellow"/>
               </w:rPr>
-              <w:t xml:space="preserve"> El Guardián de Recursos (patrón try-finally manual)</w:t>
+              <w:t xml:space="preserve"> Interfaz vs. Clase Abstracta (El Dilema Real)</w:t>
             </w:r>
             <w:r>
               <w:rPr>
@@ -1437,7 +1437,7 @@
                 <w:noProof/>
                 <w:webHidden/>
               </w:rPr>
-              <w:instrText xml:space="preserve"> PAGEREF _Toc236757136 \h </w:instrText>
+              <w:instrText xml:space="preserve"> PAGEREF _Toc236999183 \h </w:instrText>
             </w:r>
             <w:r>
               <w:rPr>
@@ -1483,7 +1483,7 @@
               <w14:ligatures w14:val="standardContextual"/>
             </w:rPr>
           </w:pPr>
-          <w:hyperlink w:anchor="_Toc236757137" w:history="1">
+          <w:hyperlink w:anchor="_Toc236999184" w:history="1">
             <w:r>
               <w:rPr>
                 <w:rStyle w:val="Hipervnculo"/>
@@ -1541,7 +1541,7 @@
                 <w:noProof/>
                 <w:w w:val="90"/>
               </w:rPr>
-              <w:t>Comparativa Final (Reflexión)</w:t>
+              <w:t>Múltiples Juramentos (Multi-Implementación)</w:t>
             </w:r>
             <w:r>
               <w:rPr>
@@ -1562,7 +1562,7 @@
                 <w:noProof/>
                 <w:webHidden/>
               </w:rPr>
-              <w:instrText xml:space="preserve"> PAGEREF _Toc236757137 \h </w:instrText>
+              <w:instrText xml:space="preserve"> PAGEREF _Toc236999184 \h </w:instrText>
             </w:r>
             <w:r>
               <w:rPr>
@@ -1597,6 +1597,7 @@
           <w:pPr>
             <w:pStyle w:val="TDC2"/>
             <w:tabs>
+              <w:tab w:val="left" w:pos="1680"/>
               <w:tab w:val="right" w:leader="dot" w:pos="10430"/>
             </w:tabs>
             <w:rPr>
@@ -1607,13 +1608,48 @@
               <w14:ligatures w14:val="standardContextual"/>
             </w:rPr>
           </w:pPr>
-          <w:hyperlink w:anchor="_Toc236757138" w:history="1">
+          <w:hyperlink w:anchor="_Toc236999185" w:history="1">
             <w:r>
               <w:rPr>
                 <w:rStyle w:val="Hipervnculo"/>
                 <w:noProof/>
               </w:rPr>
-              <w:t>Reto. "Área de Plantación, pero con recursos bien cerrados"</w:t>
+              <w:t>G.</w:t>
+            </w:r>
+            <w:r>
+              <w:rPr>
+                <w:rFonts w:asciiTheme="minorHAnsi" w:eastAsiaTheme="minorEastAsia" w:hAnsiTheme="minorHAnsi" w:cstheme="minorBidi"/>
+                <w:noProof/>
+                <w:kern w:val="2"/>
+                <w:lang w:val="en-US"/>
+                <w14:ligatures w14:val="standardContextual"/>
+              </w:rPr>
+              <w:tab/>
+            </w:r>
+            <w:r>
+              <w:rPr>
+                <w:rStyle w:val="Hipervnculo"/>
+                <w:noProof/>
+                <w:w w:val="90"/>
+              </w:rPr>
+              <w:t>Ejercicio</w:t>
+            </w:r>
+            <w:r>
+              <w:rPr>
+                <w:rStyle w:val="Hipervnculo"/>
+                <w:noProof/>
+                <w:spacing w:val="-10"/>
+                <w:w w:val="90"/>
+              </w:rPr>
+              <w:t xml:space="preserve"> </w:t>
+            </w:r>
+            <w:r>
+              <w:rPr>
+                <w:rStyle w:val="Hipervnculo"/>
+                <w:noProof/>
+                <w:w w:val="90"/>
+              </w:rPr>
+              <w:t>6: El Verdadero Polimorfismo (Contrato + Comportamiento Distinto)</w:t>
             </w:r>
             <w:r>
               <w:rPr>
@@ -1634,7 +1670,7 @@
                 <w:noProof/>
                 <w:webHidden/>
               </w:rPr>
-              <w:instrText xml:space="preserve"> PAGEREF _Toc236757138 \h </w:instrText>
+              <w:instrText xml:space="preserve"> PAGEREF _Toc236999185 \h </w:instrText>
             </w:r>
             <w:r>
               <w:rPr>
@@ -1667,6 +1703,78 @@
         </w:p>
         <w:p>
           <w:pPr>
+            <w:pStyle w:val="TDC2"/>
+            <w:tabs>
+              <w:tab w:val="right" w:leader="dot" w:pos="10430"/>
+            </w:tabs>
+            <w:rPr>
+              <w:rFonts w:asciiTheme="minorHAnsi" w:eastAsiaTheme="minorEastAsia" w:hAnsiTheme="minorHAnsi" w:cstheme="minorBidi"/>
+              <w:noProof/>
+              <w:kern w:val="2"/>
+              <w:lang w:val="en-US"/>
+              <w14:ligatures w14:val="standardContextual"/>
+            </w:rPr>
+          </w:pPr>
+          <w:hyperlink w:anchor="_Toc236999186" w:history="1">
+            <w:r>
+              <w:rPr>
+                <w:rStyle w:val="Hipervnculo"/>
+                <w:noProof/>
+              </w:rPr>
+              <w:t>Reto. "Cualquiera Puede Llevar el Escudo"</w:t>
+            </w:r>
+            <w:r>
+              <w:rPr>
+                <w:noProof/>
+                <w:webHidden/>
+              </w:rPr>
+              <w:tab/>
+            </w:r>
+            <w:r>
+              <w:rPr>
+                <w:noProof/>
+                <w:webHidden/>
+              </w:rPr>
+              <w:fldChar w:fldCharType="begin"/>
+            </w:r>
+            <w:r>
+              <w:rPr>
+                <w:noProof/>
+                <w:webHidden/>
+              </w:rPr>
+              <w:instrText xml:space="preserve"> PAGEREF _Toc236999186 \h </w:instrText>
+            </w:r>
+            <w:r>
+              <w:rPr>
+                <w:noProof/>
+                <w:webHidden/>
+              </w:rPr>
+            </w:r>
+            <w:r>
+              <w:rPr>
+                <w:noProof/>
+                <w:webHidden/>
+              </w:rPr>
+              <w:fldChar w:fldCharType="separate"/>
+            </w:r>
+            <w:r>
+              <w:rPr>
+                <w:noProof/>
+                <w:webHidden/>
+              </w:rPr>
+              <w:t>13</w:t>
+            </w:r>
+            <w:r>
+              <w:rPr>
+                <w:noProof/>
+                <w:webHidden/>
+              </w:rPr>
+              <w:fldChar w:fldCharType="end"/>
+            </w:r>
+          </w:hyperlink>
+        </w:p>
+        <w:p>
+          <w:pPr>
             <w:pStyle w:val="TDC1"/>
             <w:tabs>
               <w:tab w:val="right" w:leader="dot" w:pos="10430"/>
@@ -1679,7 +1787,7 @@
               <w14:ligatures w14:val="standardContextual"/>
             </w:rPr>
           </w:pPr>
-          <w:hyperlink w:anchor="_Toc236757139" w:history="1">
+          <w:hyperlink w:anchor="_Toc236999187" w:history="1">
             <w:r>
               <w:rPr>
                 <w:rStyle w:val="Hipervnculo"/>
@@ -1706,7 +1814,7 @@
                 <w:noProof/>
                 <w:webHidden/>
               </w:rPr>
-              <w:instrText xml:space="preserve"> PAGEREF _Toc236757139 \h </w:instrText>
+              <w:instrText xml:space="preserve"> PAGEREF _Toc236999187 \h </w:instrText>
             </w:r>
             <w:r>
               <w:rPr>
@@ -1726,7 +1834,7 @@
                 <w:noProof/>
                 <w:webHidden/>
               </w:rPr>
-              <w:t>14</w:t>
+              <w:t>15</w:t>
             </w:r>
             <w:r>
               <w:rPr>
@@ -1768,7 +1876,7 @@
           <w:numId w:val="5"/>
         </w:numPr>
       </w:pPr>
-      <w:bookmarkStart w:id="1" w:name="_Toc236757129"/>
+      <w:bookmarkStart w:id="1" w:name="_Toc236999176"/>
       <w:r>
         <w:lastRenderedPageBreak/>
         <w:t>Forjando Nuevos Caminos</w:t>
@@ -2833,7 +2941,7 @@
         </w:numPr>
       </w:pPr>
       <w:bookmarkStart w:id="2" w:name="_bookmark1"/>
-      <w:bookmarkStart w:id="3" w:name="_Toc236757130"/>
+      <w:bookmarkStart w:id="3" w:name="_Toc236999177"/>
       <w:bookmarkEnd w:id="2"/>
       <w:r>
         <w:t>Prólogo</w:t>
@@ -2862,7 +2970,7 @@
           <w:noProof/>
         </w:rPr>
         <w:drawing>
-          <wp:anchor distT="0" distB="0" distL="114300" distR="114300" simplePos="0" relativeHeight="251662336" behindDoc="0" locked="0" layoutInCell="1" allowOverlap="1" wp14:anchorId="233A80B6" wp14:editId="5B3E0202">
+          <wp:anchor distT="0" distB="0" distL="114300" distR="114300" simplePos="0" relativeHeight="251662336" behindDoc="0" locked="0" layoutInCell="1" allowOverlap="1" wp14:anchorId="233A80B6" wp14:editId="48E54A4B">
             <wp:simplePos x="0" y="0"/>
             <wp:positionH relativeFrom="column">
               <wp:posOffset>3371850</wp:posOffset>
@@ -3172,7 +3280,7 @@
         </w:numPr>
       </w:pPr>
       <w:bookmarkStart w:id="4" w:name="_bookmark2"/>
-      <w:bookmarkStart w:id="5" w:name="_Toc236757131"/>
+      <w:bookmarkStart w:id="5" w:name="_Toc236999178"/>
       <w:bookmarkEnd w:id="4"/>
       <w:r>
         <w:lastRenderedPageBreak/>
@@ -3939,7 +4047,7 @@
           </mc:Choice>
           <mc:Fallback>
             <w:pict>
-              <v:group w14:anchorId="16DEB3CA" id="Group 15" o:spid="_x0000_s1026" style="width:442.05pt;height:1.6pt;mso-position-horizontal-relative:char;mso-position-vertical-relative:line" coordsize="56140,203" o:gfxdata="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">
+              <v:group w14:anchorId="7E3F0481" id="Group 15" o:spid="_x0000_s1026" style="width:442.05pt;height:1.6pt;mso-position-horizontal-relative:char;mso-position-vertical-relative:line" coordsize="56140,203" o:gfxdata="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">
                 <v:shape id="Graphic 16" o:spid="_x0000_s1027" style="position:absolute;width:56127;height:196;visibility:visible;mso-wrap-style:square;v-text-anchor:top" coordsize="5612765,19685" o:gfxdata="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" path="m5612765,l,,,19685r5612765,l5612765,xe" fillcolor="#9f9f9f" stroked="f">
                   <v:path arrowok="t"/>
                 </v:shape>
@@ -3984,7 +4092,7 @@
         </w:numPr>
         <w:jc w:val="left"/>
       </w:pPr>
-      <w:bookmarkStart w:id="7" w:name="_Toc236757132"/>
+      <w:bookmarkStart w:id="7" w:name="_Toc236999179"/>
       <w:r>
         <w:rPr>
           <w:w w:val="90"/>
@@ -4245,7 +4353,19 @@
         <w:t>no puede tener cuerpo</w:t>
       </w:r>
       <w:r>
-        <w:t xml:space="preserve"> (no utilices la palabra clave default).</w:t>
+        <w:t xml:space="preserve"> (no utilices la palabra clave </w:t>
+      </w:r>
+      <w:r>
+        <w:rPr>
+          <w:b/>
+          <w:bCs/>
+          <w:i/>
+          <w:iCs/>
+        </w:rPr>
+        <w:t>default</w:t>
+      </w:r>
+      <w:r>
+        <w:t>).</w:t>
       </w:r>
     </w:p>
     <w:p>
@@ -4585,19 +4705,38 @@
           <w:spacing w:val="-8"/>
           <w:lang w:val="en-US"/>
         </w:rPr>
-        <w:t xml:space="preserve">: "Avengers, </w:t>
-      </w:r>
-      <w:proofErr w:type="gramStart"/>
-      <w:r>
-        <w:rPr>
+        <w:t xml:space="preserve">: </w:t>
+      </w:r>
+      <w:r>
+        <w:rPr>
+          <w:b/>
+          <w:bCs/>
+          <w:i/>
+          <w:iCs/>
           <w:spacing w:val="-8"/>
           <w:lang w:val="en-US"/>
         </w:rPr>
+        <w:t xml:space="preserve">"Avengers, </w:t>
+      </w:r>
+      <w:proofErr w:type="gramStart"/>
+      <w:r>
+        <w:rPr>
+          <w:b/>
+          <w:bCs/>
+          <w:i/>
+          <w:iCs/>
+          <w:spacing w:val="-8"/>
+          <w:lang w:val="en-US"/>
+        </w:rPr>
         <w:t>assemble</w:t>
       </w:r>
       <w:proofErr w:type="gramEnd"/>
       <w:r>
         <w:rPr>
+          <w:b/>
+          <w:bCs/>
+          <w:i/>
+          <w:iCs/>
           <w:spacing w:val="-8"/>
           <w:lang w:val="en-US"/>
         </w:rPr>
@@ -4632,6 +4771,8 @@
       <w:proofErr w:type="spellStart"/>
       <w:r>
         <w:rPr>
+          <w:b/>
+          <w:bCs/>
           <w:spacing w:val="-8"/>
         </w:rPr>
         <w:t>main</w:t>
@@ -4646,6 +4787,10 @@
       <w:proofErr w:type="spellStart"/>
       <w:r>
         <w:rPr>
+          <w:b/>
+          <w:bCs/>
+          <w:i/>
+          <w:iCs/>
           <w:spacing w:val="-8"/>
         </w:rPr>
         <w:t>CaptainAmerica</w:t>
@@ -4857,7 +5002,7 @@
         <w:jc w:val="left"/>
       </w:pPr>
       <w:bookmarkStart w:id="8" w:name="_bookmark4"/>
-      <w:bookmarkStart w:id="9" w:name="_Toc236757133"/>
+      <w:bookmarkStart w:id="9" w:name="_Toc236999180"/>
       <w:bookmarkEnd w:id="8"/>
       <w:r>
         <w:rPr>
@@ -4966,7 +5111,7 @@
         <w:rPr>
           <w:spacing w:val="-2"/>
         </w:rPr>
-        <w:t>Avenger.java, CaptainAmerica.java, Falcon.java, RosterTest.java</w:t>
+        <w:t>Falcon.java, RosterTest.java</w:t>
       </w:r>
     </w:p>
     <w:p>
@@ -5342,6 +5487,8 @@
       <w:proofErr w:type="spellStart"/>
       <w:r>
         <w:rPr>
+          <w:b/>
+          <w:bCs/>
           <w:spacing w:val="-6"/>
         </w:rPr>
         <w:t>Avenger</w:t>
@@ -5351,12 +5498,26 @@
         <w:rPr>
           <w:spacing w:val="-6"/>
         </w:rPr>
-        <w:t xml:space="preserve"> creada en el ejercicio anterior (asegúrate de que tenga el método String </w:t>
+        <w:t xml:space="preserve"> creada en el ejercicio anterior (asegúrate de que tenga el método </w:t>
+      </w:r>
+      <w:r>
+        <w:rPr>
+          <w:b/>
+          <w:bCs/>
+          <w:i/>
+          <w:iCs/>
+          <w:spacing w:val="-6"/>
+        </w:rPr>
+        <w:t xml:space="preserve">String </w:t>
       </w:r>
       <w:proofErr w:type="spellStart"/>
       <w:proofErr w:type="gramStart"/>
       <w:r>
         <w:rPr>
+          <w:b/>
+          <w:bCs/>
+          <w:i/>
+          <w:iCs/>
           <w:spacing w:val="-6"/>
         </w:rPr>
         <w:t>battleCry</w:t>
@@ -5364,6 +5525,10 @@
       <w:proofErr w:type="spellEnd"/>
       <w:r>
         <w:rPr>
+          <w:b/>
+          <w:bCs/>
+          <w:i/>
+          <w:iCs/>
           <w:spacing w:val="-6"/>
         </w:rPr>
         <w:t>(</w:t>
@@ -5371,6 +5536,10 @@
       <w:proofErr w:type="gramEnd"/>
       <w:r>
         <w:rPr>
+          <w:b/>
+          <w:bCs/>
+          <w:i/>
+          <w:iCs/>
           <w:spacing w:val="-6"/>
         </w:rPr>
         <w:t>)).</w:t>
@@ -5389,7 +5558,6 @@
         <w:ind w:left="1342"/>
         <w:rPr>
           <w:spacing w:val="-6"/>
-          <w:lang w:val="en-US"/>
         </w:rPr>
       </w:pPr>
       <w:r>
@@ -5397,243 +5565,42 @@
           <w:b/>
           <w:bCs/>
           <w:spacing w:val="-6"/>
-          <w:lang w:val="en-US"/>
-        </w:rPr>
-        <w:t xml:space="preserve">Crea las </w:t>
+        </w:rPr>
+        <w:t>Reutiliza la interfaz</w:t>
+      </w:r>
+      <w:r>
+        <w:rPr>
+          <w:spacing w:val="-6"/>
+        </w:rPr>
+        <w:t xml:space="preserve"> </w:t>
       </w:r>
       <w:proofErr w:type="spellStart"/>
       <w:r>
         <w:rPr>
-          <w:b/>
-          <w:bCs/>
           <w:spacing w:val="-6"/>
-          <w:lang w:val="en-US"/>
-        </w:rPr>
-        <w:t>clases</w:t>
+        </w:rPr>
+        <w:t>Avenger</w:t>
       </w:r>
       <w:proofErr w:type="spellEnd"/>
       <w:r>
         <w:rPr>
-          <w:b/>
-          <w:bCs/>
           <w:spacing w:val="-6"/>
-          <w:lang w:val="en-US"/>
-        </w:rPr>
-        <w:t xml:space="preserve"> </w:t>
+        </w:rPr>
+        <w:t xml:space="preserve"> y </w:t>
       </w:r>
       <w:proofErr w:type="spellStart"/>
       <w:r>
         <w:rPr>
-          <w:b/>
-          <w:bCs/>
           <w:spacing w:val="-6"/>
-          <w:lang w:val="en-US"/>
-        </w:rPr>
-        <w:t>concretas</w:t>
+        </w:rPr>
+        <w:t>CaptainAmerica</w:t>
       </w:r>
       <w:proofErr w:type="spellEnd"/>
       <w:r>
         <w:rPr>
-          <w:b/>
-          <w:bCs/>
           <w:spacing w:val="-6"/>
-          <w:lang w:val="en-US"/>
-        </w:rPr>
-        <w:t>:</w:t>
-      </w:r>
-    </w:p>
-    <w:p>
-      <w:pPr>
-        <w:numPr>
-          <w:ilvl w:val="1"/>
-          <w:numId w:val="30"/>
-        </w:numPr>
-        <w:tabs>
-          <w:tab w:val="clear" w:pos="1440"/>
-          <w:tab w:val="num" w:pos="2062"/>
-        </w:tabs>
-        <w:ind w:left="2062"/>
-        <w:rPr>
-          <w:spacing w:val="-6"/>
-        </w:rPr>
-      </w:pPr>
-      <w:proofErr w:type="spellStart"/>
-      <w:r>
-        <w:rPr>
-          <w:spacing w:val="-6"/>
-        </w:rPr>
-        <w:t>CaptainAmerica</w:t>
-      </w:r>
-      <w:proofErr w:type="spellEnd"/>
-      <w:r>
-        <w:rPr>
-          <w:spacing w:val="-6"/>
-        </w:rPr>
-        <w:t xml:space="preserve">: Debe implementar </w:t>
-      </w:r>
-      <w:proofErr w:type="spellStart"/>
-      <w:r>
-        <w:rPr>
-          <w:spacing w:val="-6"/>
-        </w:rPr>
-        <w:t>Avenger</w:t>
-      </w:r>
-      <w:proofErr w:type="spellEnd"/>
-      <w:r>
-        <w:rPr>
-          <w:spacing w:val="-6"/>
-        </w:rPr>
-        <w:t xml:space="preserve"> y hacer que su método </w:t>
-      </w:r>
-      <w:proofErr w:type="spellStart"/>
-      <w:proofErr w:type="gramStart"/>
-      <w:r>
-        <w:rPr>
-          <w:spacing w:val="-6"/>
-        </w:rPr>
-        <w:t>battleCry</w:t>
-      </w:r>
-      <w:proofErr w:type="spellEnd"/>
-      <w:r>
-        <w:rPr>
-          <w:spacing w:val="-6"/>
-        </w:rPr>
-        <w:t>(</w:t>
-      </w:r>
-      <w:proofErr w:type="gramEnd"/>
-      <w:r>
-        <w:rPr>
-          <w:spacing w:val="-6"/>
-        </w:rPr>
-        <w:t>) retorne "</w:t>
-      </w:r>
-      <w:proofErr w:type="spellStart"/>
-      <w:r>
-        <w:rPr>
-          <w:spacing w:val="-6"/>
-        </w:rPr>
-        <w:t>Avengers</w:t>
-      </w:r>
-      <w:proofErr w:type="spellEnd"/>
-      <w:r>
-        <w:rPr>
-          <w:spacing w:val="-6"/>
-        </w:rPr>
-        <w:t xml:space="preserve">, </w:t>
-      </w:r>
-      <w:proofErr w:type="spellStart"/>
-      <w:r>
-        <w:rPr>
-          <w:spacing w:val="-6"/>
-        </w:rPr>
-        <w:t>assemble</w:t>
-      </w:r>
-      <w:proofErr w:type="spellEnd"/>
-      <w:r>
-        <w:rPr>
-          <w:spacing w:val="-6"/>
-        </w:rPr>
-        <w:t>!".</w:t>
-      </w:r>
-    </w:p>
-    <w:p>
-      <w:pPr>
-        <w:numPr>
-          <w:ilvl w:val="1"/>
-          <w:numId w:val="30"/>
-        </w:numPr>
-        <w:tabs>
-          <w:tab w:val="clear" w:pos="1440"/>
-          <w:tab w:val="num" w:pos="2062"/>
-        </w:tabs>
-        <w:ind w:left="2062"/>
-        <w:rPr>
-          <w:spacing w:val="-6"/>
-        </w:rPr>
-      </w:pPr>
-      <w:r>
-        <w:rPr>
-          <w:spacing w:val="-6"/>
-        </w:rPr>
-        <w:t xml:space="preserve">Falcon: Debe implementar </w:t>
-      </w:r>
-      <w:proofErr w:type="spellStart"/>
-      <w:r>
-        <w:rPr>
-          <w:spacing w:val="-6"/>
-        </w:rPr>
-        <w:t>Avenger</w:t>
-      </w:r>
-      <w:proofErr w:type="spellEnd"/>
-      <w:r>
-        <w:rPr>
-          <w:spacing w:val="-6"/>
-        </w:rPr>
-        <w:t xml:space="preserve"> y hacer que su método </w:t>
-      </w:r>
-      <w:proofErr w:type="spellStart"/>
-      <w:proofErr w:type="gramStart"/>
-      <w:r>
-        <w:rPr>
-          <w:spacing w:val="-6"/>
-        </w:rPr>
-        <w:t>battleCry</w:t>
-      </w:r>
-      <w:proofErr w:type="spellEnd"/>
-      <w:r>
-        <w:rPr>
-          <w:spacing w:val="-6"/>
-        </w:rPr>
-        <w:t>(</w:t>
-      </w:r>
-      <w:proofErr w:type="gramEnd"/>
-      <w:r>
-        <w:rPr>
-          <w:spacing w:val="-6"/>
-        </w:rPr>
-        <w:t>) retorne "</w:t>
-      </w:r>
-      <w:proofErr w:type="spellStart"/>
-      <w:r>
-        <w:rPr>
-          <w:spacing w:val="-6"/>
-        </w:rPr>
-        <w:t>On</w:t>
-      </w:r>
-      <w:proofErr w:type="spellEnd"/>
-      <w:r>
-        <w:rPr>
-          <w:spacing w:val="-6"/>
-        </w:rPr>
-        <w:t xml:space="preserve"> </w:t>
-      </w:r>
-      <w:proofErr w:type="spellStart"/>
-      <w:r>
-        <w:rPr>
-          <w:spacing w:val="-6"/>
-        </w:rPr>
-        <w:t>your</w:t>
-      </w:r>
-      <w:proofErr w:type="spellEnd"/>
-      <w:r>
-        <w:rPr>
-          <w:spacing w:val="-6"/>
-        </w:rPr>
-        <w:t xml:space="preserve"> </w:t>
-      </w:r>
-      <w:proofErr w:type="spellStart"/>
-      <w:r>
-        <w:rPr>
-          <w:spacing w:val="-6"/>
-        </w:rPr>
-        <w:t>left</w:t>
-      </w:r>
-      <w:proofErr w:type="spellEnd"/>
-      <w:r>
-        <w:rPr>
-          <w:spacing w:val="-6"/>
-        </w:rPr>
-        <w:t>!".</w:t>
+        </w:rPr>
+        <w:t xml:space="preserve"> de ex0, importándolas.</w:t>
       </w:r>
     </w:p>
     <w:p>
@@ -5916,7 +5883,7 @@
                                 <w:sz w:val="20"/>
                                 <w:szCs w:val="20"/>
                               </w:rPr>
-                              <w:t>Captain America says: Avengers, assemble!</w:t>
+                              <w:t>Avengers, assemble!</w:t>
                             </w:r>
                           </w:p>
                           <w:p>
@@ -5934,7 +5901,7 @@
                                 <w:sz w:val="20"/>
                                 <w:szCs w:val="20"/>
                               </w:rPr>
-                              <w:t>Falcon says: On your left!</w:t>
+                              <w:t>On your left!</w:t>
                             </w:r>
                           </w:p>
                         </w:txbxContent>
@@ -5977,7 +5944,7 @@
                           <w:sz w:val="20"/>
                           <w:szCs w:val="20"/>
                         </w:rPr>
-                        <w:t>Captain America says: Avengers, assemble!</w:t>
+                        <w:t>Avengers, assemble!</w:t>
                       </w:r>
                     </w:p>
                     <w:p>
@@ -5995,7 +5962,7 @@
                           <w:sz w:val="20"/>
                           <w:szCs w:val="20"/>
                         </w:rPr>
-                        <w:t>Falcon says: On your left!</w:t>
+                        <w:t>On your left!</w:t>
                       </w:r>
                     </w:p>
                   </w:txbxContent>
@@ -6049,7 +6016,7 @@
         <w:jc w:val="left"/>
       </w:pPr>
       <w:bookmarkStart w:id="10" w:name="_bookmark5"/>
-      <w:bookmarkStart w:id="11" w:name="_Toc236757134"/>
+      <w:bookmarkStart w:id="11" w:name="_Toc236999181"/>
       <w:bookmarkEnd w:id="10"/>
       <w:r>
         <w:rPr>
@@ -6581,11 +6548,31 @@
         <w:rPr>
           <w:spacing w:val="-6"/>
         </w:rPr>
-        <w:t xml:space="preserve">Añade un método con la palabra clave default llamado </w:t>
+        <w:t xml:space="preserve">Añade un método con la palabra clave </w:t>
+      </w:r>
+      <w:r>
+        <w:rPr>
+          <w:b/>
+          <w:bCs/>
+          <w:i/>
+          <w:iCs/>
+          <w:spacing w:val="-6"/>
+        </w:rPr>
+        <w:t>default</w:t>
+      </w:r>
+      <w:r>
+        <w:rPr>
+          <w:spacing w:val="-6"/>
+        </w:rPr>
+        <w:t xml:space="preserve"> llamado </w:t>
       </w:r>
       <w:proofErr w:type="gramStart"/>
       <w:r>
         <w:rPr>
+          <w:b/>
+          <w:bCs/>
+          <w:i/>
+          <w:iCs/>
           <w:spacing w:val="-6"/>
         </w:rPr>
         <w:t>introduce(</w:t>
@@ -6593,13 +6580,25 @@
       <w:proofErr w:type="gramEnd"/>
       <w:r>
         <w:rPr>
+          <w:b/>
+          <w:bCs/>
+          <w:i/>
+          <w:iCs/>
           <w:spacing w:val="-6"/>
         </w:rPr>
-        <w:t xml:space="preserve">). Este método debe ser de tipo </w:t>
+        <w:t>).</w:t>
+      </w:r>
+      <w:r>
+        <w:rPr>
+          <w:spacing w:val="-6"/>
+        </w:rPr>
+        <w:t xml:space="preserve"> Este método debe ser de tipo </w:t>
       </w:r>
       <w:proofErr w:type="spellStart"/>
       <w:r>
         <w:rPr>
+          <w:b/>
+          <w:bCs/>
           <w:spacing w:val="-6"/>
         </w:rPr>
         <w:t>void</w:t>
@@ -6744,6 +6743,10 @@
       <w:proofErr w:type="spellStart"/>
       <w:r>
         <w:rPr>
+          <w:b/>
+          <w:bCs/>
+          <w:i/>
+          <w:iCs/>
           <w:spacing w:val="-6"/>
           <w:lang w:val="en-US"/>
         </w:rPr>
@@ -6787,7 +6790,43 @@
           <w:spacing w:val="-6"/>
           <w:lang w:val="en-US"/>
         </w:rPr>
-        <w:t xml:space="preserve"> Avenger (implements Avenger).</w:t>
+        <w:t xml:space="preserve"> </w:t>
+      </w:r>
+      <w:r>
+        <w:rPr>
+          <w:b/>
+          <w:bCs/>
+          <w:i/>
+          <w:iCs/>
+          <w:spacing w:val="-6"/>
+          <w:lang w:val="en-US"/>
+        </w:rPr>
+        <w:t>Avenger</w:t>
+      </w:r>
+      <w:r>
+        <w:rPr>
+          <w:spacing w:val="-6"/>
+          <w:lang w:val="en-US"/>
+        </w:rPr>
+        <w:t xml:space="preserve"> (</w:t>
+      </w:r>
+      <w:r>
+        <w:rPr>
+          <w:b/>
+          <w:bCs/>
+          <w:i/>
+          <w:iCs/>
+          <w:spacing w:val="-6"/>
+          <w:lang w:val="en-US"/>
+        </w:rPr>
+        <w:t>implements Avenger</w:t>
+      </w:r>
+      <w:r>
+        <w:rPr>
+          <w:spacing w:val="-6"/>
+          <w:lang w:val="en-US"/>
+        </w:rPr>
+        <w:t>).</w:t>
       </w:r>
     </w:p>
     <w:p>
@@ -6800,6 +6839,10 @@
           <w:tab w:val="num" w:pos="1440"/>
         </w:tabs>
         <w:rPr>
+          <w:b/>
+          <w:bCs/>
+          <w:i/>
+          <w:iCs/>
           <w:spacing w:val="-6"/>
           <w:lang w:val="en-US"/>
         </w:rPr>
@@ -6814,6 +6857,10 @@
       <w:proofErr w:type="gramStart"/>
       <w:r>
         <w:rPr>
+          <w:b/>
+          <w:bCs/>
+          <w:i/>
+          <w:iCs/>
           <w:spacing w:val="-6"/>
         </w:rPr>
         <w:t>battleCry</w:t>
@@ -6830,11 +6877,25 @@
         <w:rPr>
           <w:spacing w:val="-6"/>
         </w:rPr>
-        <w:t xml:space="preserve">) utilizando @Override, haciendo que retorne el texto: "Ready </w:t>
+        <w:t xml:space="preserve">) utilizando @Override, haciendo que retorne el texto: </w:t>
+      </w:r>
+      <w:r>
+        <w:rPr>
+          <w:b/>
+          <w:bCs/>
+          <w:i/>
+          <w:iCs/>
+          <w:spacing w:val="-6"/>
+        </w:rPr>
+        <w:t xml:space="preserve">"Ready </w:t>
       </w:r>
       <w:proofErr w:type="spellStart"/>
       <w:r>
         <w:rPr>
+          <w:b/>
+          <w:bCs/>
+          <w:i/>
+          <w:iCs/>
           <w:spacing w:val="-6"/>
         </w:rPr>
         <w:t>to</w:t>
@@ -6842,6 +6903,10 @@
       <w:proofErr w:type="spellEnd"/>
       <w:r>
         <w:rPr>
+          <w:b/>
+          <w:bCs/>
+          <w:i/>
+          <w:iCs/>
           <w:spacing w:val="-6"/>
         </w:rPr>
         <w:t xml:space="preserve"> </w:t>
@@ -6849,6 +6914,10 @@
       <w:proofErr w:type="spellStart"/>
       <w:r>
         <w:rPr>
+          <w:b/>
+          <w:bCs/>
+          <w:i/>
+          <w:iCs/>
           <w:spacing w:val="-6"/>
         </w:rPr>
         <w:t>comply</w:t>
@@ -6856,6 +6925,10 @@
       <w:proofErr w:type="spellEnd"/>
       <w:r>
         <w:rPr>
+          <w:b/>
+          <w:bCs/>
+          <w:i/>
+          <w:iCs/>
           <w:spacing w:val="-6"/>
         </w:rPr>
         <w:t xml:space="preserve">... no, </w:t>
@@ -6863,6 +6936,10 @@
       <w:proofErr w:type="spellStart"/>
       <w:r>
         <w:rPr>
+          <w:b/>
+          <w:bCs/>
+          <w:i/>
+          <w:iCs/>
           <w:spacing w:val="-6"/>
         </w:rPr>
         <w:t>wait</w:t>
@@ -6870,12 +6947,20 @@
       <w:proofErr w:type="spellEnd"/>
       <w:r>
         <w:rPr>
+          <w:b/>
+          <w:bCs/>
+          <w:i/>
+          <w:iCs/>
           <w:spacing w:val="-6"/>
         </w:rPr>
         <w:t xml:space="preserve">. </w:t>
       </w:r>
       <w:r>
         <w:rPr>
+          <w:b/>
+          <w:bCs/>
+          <w:i/>
+          <w:iCs/>
           <w:spacing w:val="-6"/>
           <w:lang w:val="en-US"/>
         </w:rPr>
@@ -6922,6 +7007,10 @@
       <w:proofErr w:type="gramStart"/>
       <w:r>
         <w:rPr>
+          <w:b/>
+          <w:bCs/>
+          <w:i/>
+          <w:iCs/>
           <w:spacing w:val="-6"/>
         </w:rPr>
         <w:t>introduce(</w:t>
@@ -6929,9 +7018,19 @@
       <w:proofErr w:type="gramEnd"/>
       <w:r>
         <w:rPr>
+          <w:b/>
+          <w:bCs/>
+          <w:i/>
+          <w:iCs/>
           <w:spacing w:val="-6"/>
         </w:rPr>
-        <w:t xml:space="preserve">) dentro de </w:t>
+        <w:t>)</w:t>
+      </w:r>
+      <w:r>
+        <w:rPr>
+          <w:spacing w:val="-6"/>
+        </w:rPr>
+        <w:t xml:space="preserve"> dentro de </w:t>
       </w:r>
       <w:proofErr w:type="spellStart"/>
       <w:r>
@@ -7384,7 +7483,7 @@
         <w:jc w:val="left"/>
       </w:pPr>
       <w:bookmarkStart w:id="12" w:name="_bookmark6"/>
-      <w:bookmarkStart w:id="13" w:name="_Toc236757135"/>
+      <w:bookmarkStart w:id="13" w:name="_Toc236999182"/>
       <w:bookmarkEnd w:id="12"/>
       <w:r>
         <w:rPr>
@@ -7807,7 +7906,21 @@
         <w:rPr>
           <w:lang w:val="es-ES"/>
         </w:rPr>
-        <w:t>En los ejercicios anteriores utilizaste interfaces (</w:t>
+        <w:t xml:space="preserve">En los ejercicios anteriores utilizaste </w:t>
+      </w:r>
+      <w:r>
+        <w:rPr>
+          <w:b/>
+          <w:bCs/>
+          <w:lang w:val="es-ES"/>
+        </w:rPr>
+        <w:t>interfaces</w:t>
+      </w:r>
+      <w:r>
+        <w:rPr>
+          <w:lang w:val="es-ES"/>
+        </w:rPr>
+        <w:t xml:space="preserve"> (</w:t>
       </w:r>
       <w:proofErr w:type="gramStart"/>
       <w:r>
@@ -7972,6 +8085,10 @@
       <w:proofErr w:type="gramStart"/>
       <w:r>
         <w:rPr>
+          <w:b/>
+          <w:bCs/>
+          <w:i/>
+          <w:iCs/>
           <w:lang w:val="es-ES"/>
         </w:rPr>
         <w:t>raiseShield</w:t>
@@ -7979,6 +8096,10 @@
       <w:proofErr w:type="spellEnd"/>
       <w:r>
         <w:rPr>
+          <w:b/>
+          <w:bCs/>
+          <w:i/>
+          <w:iCs/>
           <w:lang w:val="es-ES"/>
         </w:rPr>
         <w:t>(</w:t>
@@ -7986,9 +8107,19 @@
       <w:proofErr w:type="gramEnd"/>
       <w:r>
         <w:rPr>
-          <w:lang w:val="es-ES"/>
-        </w:rPr>
-        <w:t xml:space="preserve">) que imprima por consola exactamente el texto: "Shield </w:t>
+          <w:b/>
+          <w:bCs/>
+          <w:i/>
+          <w:iCs/>
+          <w:lang w:val="es-ES"/>
+        </w:rPr>
+        <w:t>)</w:t>
+      </w:r>
+      <w:r>
+        <w:rPr>
+          <w:lang w:val="es-ES"/>
+        </w:rPr>
+        <w:t xml:space="preserve"> que imprima por consola exactamente el texto: "Shield </w:t>
       </w:r>
       <w:proofErr w:type="spellStart"/>
       <w:r>
@@ -8039,12 +8170,16 @@
         <w:rPr>
           <w:lang w:val="es-ES"/>
         </w:rPr>
-        <w:t xml:space="preserve">) de tipo String llamado </w:t>
+        <w:t xml:space="preserve"> de tipo String llamado </w:t>
       </w:r>
       <w:proofErr w:type="spellStart"/>
       <w:proofErr w:type="gramStart"/>
       <w:r>
         <w:rPr>
+          <w:b/>
+          <w:bCs/>
+          <w:i/>
+          <w:iCs/>
           <w:lang w:val="es-ES"/>
         </w:rPr>
         <w:t>motto</w:t>
@@ -8052,6 +8187,10 @@
       <w:proofErr w:type="spellEnd"/>
       <w:r>
         <w:rPr>
+          <w:b/>
+          <w:bCs/>
+          <w:i/>
+          <w:iCs/>
           <w:lang w:val="es-ES"/>
         </w:rPr>
         <w:t>(</w:t>
@@ -8059,13 +8198,25 @@
       <w:proofErr w:type="gramEnd"/>
       <w:r>
         <w:rPr>
-          <w:lang w:val="es-ES"/>
-        </w:rPr>
-        <w:t xml:space="preserve">). Esto obliga a cualquier clase que extienda de </w:t>
+          <w:b/>
+          <w:bCs/>
+          <w:i/>
+          <w:iCs/>
+          <w:lang w:val="es-ES"/>
+        </w:rPr>
+        <w:t>).</w:t>
+      </w:r>
+      <w:r>
+        <w:rPr>
+          <w:lang w:val="es-ES"/>
+        </w:rPr>
+        <w:t xml:space="preserve"> Esto obliga a cualquier clase que extienda de </w:t>
       </w:r>
       <w:proofErr w:type="spellStart"/>
       <w:r>
         <w:rPr>
+          <w:b/>
+          <w:bCs/>
           <w:lang w:val="es-ES"/>
         </w:rPr>
         <w:t>ShieldBearer</w:t>
@@ -8156,6 +8307,10 @@
       <w:proofErr w:type="spellStart"/>
       <w:r>
         <w:rPr>
+          <w:b/>
+          <w:bCs/>
+          <w:i/>
+          <w:iCs/>
           <w:lang w:val="es-ES"/>
         </w:rPr>
         <w:t>SamWilson</w:t>
@@ -8170,6 +8325,10 @@
       <w:proofErr w:type="spellStart"/>
       <w:r>
         <w:rPr>
+          <w:b/>
+          <w:bCs/>
+          <w:i/>
+          <w:iCs/>
           <w:lang w:val="es-ES"/>
         </w:rPr>
         <w:t>extends</w:t>
@@ -8177,6 +8336,10 @@
       <w:proofErr w:type="spellEnd"/>
       <w:r>
         <w:rPr>
+          <w:b/>
+          <w:bCs/>
+          <w:i/>
+          <w:iCs/>
           <w:lang w:val="es-ES"/>
         </w:rPr>
         <w:t xml:space="preserve"> </w:t>
@@ -8184,6 +8347,10 @@
       <w:proofErr w:type="spellStart"/>
       <w:r>
         <w:rPr>
+          <w:b/>
+          <w:bCs/>
+          <w:i/>
+          <w:iCs/>
           <w:lang w:val="es-ES"/>
         </w:rPr>
         <w:t>ShieldBearer</w:t>
@@ -8213,7 +8380,21 @@
         <w:rPr>
           <w:lang w:val="es-ES"/>
         </w:rPr>
-        <w:t xml:space="preserve">Utiliza la anotación @Override para implementar el método abstracto </w:t>
+        <w:t xml:space="preserve">Utiliza la anotación </w:t>
+      </w:r>
+      <w:r>
+        <w:rPr>
+          <w:b/>
+          <w:bCs/>
+          <w:lang w:val="es-ES"/>
+        </w:rPr>
+        <w:t>@Override</w:t>
+      </w:r>
+      <w:r>
+        <w:rPr>
+          <w:lang w:val="es-ES"/>
+        </w:rPr>
+        <w:t xml:space="preserve"> para implementar el método abstracto </w:t>
       </w:r>
       <w:proofErr w:type="spellStart"/>
       <w:proofErr w:type="gramStart"/>
@@ -8235,11 +8416,21 @@
         <w:rPr>
           <w:lang w:val="es-ES"/>
         </w:rPr>
-        <w:t xml:space="preserve">), haciendo que retorne el texto: "The </w:t>
+        <w:t>), haciendo que retorne el texto: "</w:t>
+      </w:r>
+      <w:r>
+        <w:rPr>
+          <w:b/>
+          <w:bCs/>
+          <w:lang w:val="es-ES"/>
+        </w:rPr>
+        <w:t xml:space="preserve">The </w:t>
       </w:r>
       <w:proofErr w:type="spellStart"/>
       <w:r>
         <w:rPr>
+          <w:b/>
+          <w:bCs/>
           <w:lang w:val="es-ES"/>
         </w:rPr>
         <w:t>shield</w:t>
@@ -8247,6 +8438,8 @@
       <w:proofErr w:type="spellEnd"/>
       <w:r>
         <w:rPr>
+          <w:b/>
+          <w:bCs/>
           <w:lang w:val="es-ES"/>
         </w:rPr>
         <w:t xml:space="preserve"> </w:t>
@@ -8254,6 +8447,8 @@
       <w:proofErr w:type="spellStart"/>
       <w:r>
         <w:rPr>
+          <w:b/>
+          <w:bCs/>
           <w:lang w:val="es-ES"/>
         </w:rPr>
         <w:t>doesn't</w:t>
@@ -8261,6 +8456,8 @@
       <w:proofErr w:type="spellEnd"/>
       <w:r>
         <w:rPr>
+          <w:b/>
+          <w:bCs/>
           <w:lang w:val="es-ES"/>
         </w:rPr>
         <w:t xml:space="preserve"> </w:t>
@@ -8268,6 +8465,8 @@
       <w:proofErr w:type="spellStart"/>
       <w:r>
         <w:rPr>
+          <w:b/>
+          <w:bCs/>
           <w:lang w:val="es-ES"/>
         </w:rPr>
         <w:t>belong</w:t>
@@ -8275,6 +8474,8 @@
       <w:proofErr w:type="spellEnd"/>
       <w:r>
         <w:rPr>
+          <w:b/>
+          <w:bCs/>
           <w:lang w:val="es-ES"/>
         </w:rPr>
         <w:t xml:space="preserve"> </w:t>
@@ -8282,6 +8483,8 @@
       <w:proofErr w:type="spellStart"/>
       <w:r>
         <w:rPr>
+          <w:b/>
+          <w:bCs/>
           <w:lang w:val="es-ES"/>
         </w:rPr>
         <w:t>to</w:t>
@@ -8289,6 +8492,8 @@
       <w:proofErr w:type="spellEnd"/>
       <w:r>
         <w:rPr>
+          <w:b/>
+          <w:bCs/>
           <w:lang w:val="es-ES"/>
         </w:rPr>
         <w:t xml:space="preserve"> a </w:t>
@@ -8296,6 +8501,8 @@
       <w:proofErr w:type="spellStart"/>
       <w:r>
         <w:rPr>
+          <w:b/>
+          <w:bCs/>
           <w:lang w:val="es-ES"/>
         </w:rPr>
         <w:t>man</w:t>
@@ -8389,6 +8596,10 @@
       <w:proofErr w:type="spellStart"/>
       <w:r>
         <w:rPr>
+          <w:b/>
+          <w:bCs/>
+          <w:i/>
+          <w:iCs/>
           <w:lang w:val="es-ES"/>
         </w:rPr>
         <w:t>SamWilson</w:t>
@@ -8403,6 +8614,10 @@
       <w:proofErr w:type="spellStart"/>
       <w:r>
         <w:rPr>
+          <w:b/>
+          <w:bCs/>
+          <w:i/>
+          <w:iCs/>
           <w:lang w:val="es-ES"/>
         </w:rPr>
         <w:t>SamWilson</w:t>
@@ -8417,6 +8632,10 @@
       <w:proofErr w:type="spellStart"/>
       <w:r>
         <w:rPr>
+          <w:b/>
+          <w:bCs/>
+          <w:i/>
+          <w:iCs/>
           <w:lang w:val="es-ES"/>
         </w:rPr>
         <w:t>ShieldBearer</w:t>
@@ -8455,6 +8674,10 @@
       <w:proofErr w:type="gramStart"/>
       <w:r>
         <w:rPr>
+          <w:b/>
+          <w:bCs/>
+          <w:i/>
+          <w:iCs/>
           <w:lang w:val="es-ES"/>
         </w:rPr>
         <w:t>raiseShield</w:t>
@@ -8500,6 +8723,10 @@
       <w:proofErr w:type="gramStart"/>
       <w:r>
         <w:rPr>
+          <w:b/>
+          <w:bCs/>
+          <w:i/>
+          <w:iCs/>
           <w:lang w:val="es-ES"/>
         </w:rPr>
         <w:t>motto</w:t>
@@ -8753,13 +8980,17 @@
           <w:numId w:val="6"/>
         </w:numPr>
         <w:jc w:val="left"/>
+        <w:rPr>
+          <w:highlight w:val="yellow"/>
+        </w:rPr>
       </w:pPr>
       <w:bookmarkStart w:id="14" w:name="_bookmark7"/>
-      <w:bookmarkStart w:id="15" w:name="_Toc236757136"/>
+      <w:bookmarkStart w:id="15" w:name="_Toc236999183"/>
       <w:bookmarkEnd w:id="14"/>
       <w:r>
         <w:rPr>
           <w:w w:val="90"/>
+          <w:highlight w:val="yellow"/>
         </w:rPr>
         <w:lastRenderedPageBreak/>
         <w:t>Ejercicio</w:t>
@@ -8768,12 +8999,14 @@
         <w:rPr>
           <w:spacing w:val="-7"/>
           <w:w w:val="90"/>
+          <w:highlight w:val="yellow"/>
         </w:rPr>
         <w:t xml:space="preserve"> </w:t>
       </w:r>
       <w:r>
         <w:rPr>
           <w:w w:val="90"/>
+          <w:highlight w:val="yellow"/>
         </w:rPr>
         <w:t>4:</w:t>
       </w:r>
@@ -8781,17 +9014,19 @@
         <w:rPr>
           <w:spacing w:val="-7"/>
           <w:w w:val="90"/>
+          <w:highlight w:val="yellow"/>
         </w:rPr>
         <w:t xml:space="preserve"> </w:t>
       </w:r>
-      <w:bookmarkEnd w:id="15"/>
       <w:r>
         <w:rPr>
           <w:spacing w:val="-7"/>
           <w:w w:val="90"/>
+          <w:highlight w:val="yellow"/>
         </w:rPr>
         <w:t>Interfaz vs. Clase Abstracta (El Dilema Real)</w:t>
       </w:r>
+      <w:bookmarkEnd w:id="15"/>
     </w:p>
     <w:p>
       <w:pPr>
@@ -9155,7 +9390,7 @@
         <w:jc w:val="left"/>
       </w:pPr>
       <w:bookmarkStart w:id="16" w:name="_bookmark8"/>
-      <w:bookmarkStart w:id="17" w:name="_Toc236757137"/>
+      <w:bookmarkStart w:id="17" w:name="_Toc236999184"/>
       <w:bookmarkEnd w:id="16"/>
       <w:r>
         <w:rPr>
@@ -9184,13 +9419,13 @@
         </w:rPr>
         <w:t xml:space="preserve"> </w:t>
       </w:r>
+      <w:r>
+        <w:rPr>
+          <w:w w:val="90"/>
+        </w:rPr>
+        <w:t>Múltiples Juramentos (Multi-Implementación)</w:t>
+      </w:r>
       <w:bookmarkEnd w:id="17"/>
-      <w:r>
-        <w:rPr>
-          <w:w w:val="90"/>
-        </w:rPr>
-        <w:t>Múltiples Juramentos (Multi-Implementación)</w:t>
-      </w:r>
     </w:p>
     <w:p>
       <w:pPr>
@@ -10500,6 +10735,7 @@
         <w:ind w:left="913" w:right="363" w:hanging="289"/>
         <w:jc w:val="left"/>
       </w:pPr>
+      <w:bookmarkStart w:id="18" w:name="_Toc236999185"/>
       <w:r>
         <w:rPr>
           <w:w w:val="90"/>
@@ -10520,6 +10756,7 @@
         </w:rPr>
         <w:t>6: El Verdadero Polimorfismo (Contrato + Comportamiento Distinto)</w:t>
       </w:r>
+      <w:bookmarkEnd w:id="18"/>
     </w:p>
     <w:p>
       <w:pPr>
@@ -12529,19 +12766,19 @@
         <w:ind w:left="1202" w:hanging="556"/>
         <w:jc w:val="left"/>
       </w:pPr>
-      <w:bookmarkStart w:id="18" w:name="_bookmark9"/>
-      <w:bookmarkStart w:id="19" w:name="_Toc234568067"/>
-      <w:bookmarkStart w:id="20" w:name="_Toc236757138"/>
-      <w:bookmarkEnd w:id="18"/>
+      <w:bookmarkStart w:id="19" w:name="_bookmark9"/>
+      <w:bookmarkStart w:id="20" w:name="_Toc234568067"/>
+      <w:bookmarkStart w:id="21" w:name="_Toc236999186"/>
+      <w:bookmarkEnd w:id="19"/>
       <w:r>
         <w:lastRenderedPageBreak/>
         <w:t xml:space="preserve">Reto. </w:t>
       </w:r>
-      <w:bookmarkEnd w:id="19"/>
       <w:bookmarkEnd w:id="20"/>
       <w:r>
         <w:t>"Cualquiera Puede Llevar el Escudo"</w:t>
       </w:r>
+      <w:bookmarkEnd w:id="21"/>
     </w:p>
     <w:p>
       <w:pPr>
@@ -15701,19 +15938,7 @@
         <w:rPr>
           <w:lang w:val="es-ES"/>
         </w:rPr>
-        <w:t xml:space="preserve"> — eso es lo que te permite tratarlos de forma </w:t>
-      </w:r>
-      <w:r>
-        <w:rPr>
-          <w:lang w:val="es-ES"/>
-        </w:rPr>
-        <w:t>uniforme,</w:t>
-      </w:r>
-      <w:r>
-        <w:rPr>
-          <w:lang w:val="es-ES"/>
-        </w:rPr>
-        <w:t xml:space="preserve"> aunque sean clases distintas. </w:t>
+        <w:t xml:space="preserve"> — eso es lo que te permite tratarlos de forma uniforme, aunque sean clases distintas. </w:t>
       </w:r>
     </w:p>
     <w:p>
@@ -16044,14 +16269,14 @@
         <w:pStyle w:val="Ttulo1"/>
         <w:ind w:left="0" w:firstLine="622"/>
       </w:pPr>
-      <w:bookmarkStart w:id="21" w:name="_bookmark11"/>
-      <w:bookmarkStart w:id="22" w:name="_Toc236757139"/>
-      <w:bookmarkEnd w:id="21"/>
+      <w:bookmarkStart w:id="22" w:name="_bookmark11"/>
+      <w:bookmarkStart w:id="23" w:name="_Toc236999187"/>
+      <w:bookmarkEnd w:id="22"/>
       <w:r>
         <w:lastRenderedPageBreak/>
         <w:t>Ejecución</w:t>
       </w:r>
-      <w:bookmarkEnd w:id="22"/>
+      <w:bookmarkEnd w:id="23"/>
     </w:p>
     <w:p>
       <w:pPr>
@@ -17205,7 +17430,7 @@
         </mc:Choice>
         <mc:Fallback>
           <w:pict>
-            <v:shape w14:anchorId="345D644F" id="Graphic 4" o:spid="_x0000_s1026" style="position:absolute;margin-left:86.45pt;margin-top:719.75pt;width:476.5pt;height:25.2pt;z-index:-251659264;visibility:visible;mso-wrap-style:square;mso-wrap-distance-left:0;mso-wrap-distance-top:0;mso-wrap-distance-right:0;mso-wrap-distance-bottom:0;mso-position-horizontal:absolute;mso-position-horizontal-relative:page;mso-position-vertical:absolute;mso-position-vertical-relative:page;v-text-anchor:top" coordsize="6051550,320040" o:gfxdata="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" path="m6051397,l5594197,,,12,,18605r5594197,l5594197,320040r457200,l6051397,xe" fillcolor="black" stroked="f">
+            <v:shape w14:anchorId="2ED170D8" id="Graphic 4" o:spid="_x0000_s1026" style="position:absolute;margin-left:86.45pt;margin-top:719.75pt;width:476.5pt;height:25.2pt;z-index:-251659264;visibility:visible;mso-wrap-style:square;mso-wrap-distance-left:0;mso-wrap-distance-top:0;mso-wrap-distance-right:0;mso-wrap-distance-bottom:0;mso-position-horizontal:absolute;mso-position-horizontal-relative:page;mso-position-vertical:absolute;mso-position-vertical-relative:page;v-text-anchor:top" coordsize="6051550,320040" o:gfxdata="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" path="m6051397,l5594197,,,12,,18605r5594197,l5594197,320040r457200,l6051397,xe" fillcolor="black" stroked="f">
               <v:path arrowok="t"/>
               <w10:wrap anchorx="page" anchory="page"/>
             </v:shape>

</xml_diff>

<commit_message>
finished module 07 + reto + subject
</commit_message>
<xml_diff>
--- a/subjects/subject_words/java07_es_subject.docx
+++ b/subjects/subject_words/java07_es_subject.docx
@@ -430,7 +430,7 @@
           </mc:Choice>
           <mc:Fallback>
             <w:pict>
-              <v:shape w14:anchorId="333BE2A8" id="Graphic 3" o:spid="_x0000_s1026" style="position:absolute;margin-left:86.45pt;margin-top:20.05pt;width:476.5pt;height:25.2pt;z-index:-251656704;visibility:visible;mso-wrap-style:square;mso-wrap-distance-left:0;mso-wrap-distance-top:0;mso-wrap-distance-right:0;mso-wrap-distance-bottom:0;mso-position-horizontal:absolute;mso-position-horizontal-relative:page;mso-position-vertical:absolute;mso-position-vertical-relative:text;v-text-anchor:top" coordsize="6051550,320040" o:gfxdata="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" path="m6051397,l5594197,,,12,,18605r5594197,l5594197,320040r457200,l6051397,xe" fillcolor="black" stroked="f">
+              <v:shape w14:anchorId="2225ADEA" id="Graphic 3" o:spid="_x0000_s1026" style="position:absolute;margin-left:86.45pt;margin-top:20.05pt;width:476.5pt;height:25.2pt;z-index:-251656704;visibility:visible;mso-wrap-style:square;mso-wrap-distance-left:0;mso-wrap-distance-top:0;mso-wrap-distance-right:0;mso-wrap-distance-bottom:0;mso-position-horizontal:absolute;mso-position-horizontal-relative:page;mso-position-vertical:absolute;mso-position-vertical-relative:text;v-text-anchor:top" coordsize="6051550,320040" o:gfxdata="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" path="m6051397,l5594197,,,12,,18605r5594197,l5594197,320040r457200,l6051397,xe" fillcolor="black" stroked="f">
                 <v:path arrowok="t"/>
                 <w10:wrap type="topAndBottom" anchorx="page"/>
               </v:shape>
@@ -456,7 +456,7 @@
         </w:sectPr>
       </w:pPr>
     </w:p>
-    <w:bookmarkStart w:id="0" w:name="_Toc236999175" w:displacedByCustomXml="next"/>
+    <w:bookmarkStart w:id="0" w:name="_Toc237085406" w:displacedByCustomXml="next"/>
     <w:sdt>
       <w:sdtPr>
         <w:rPr>
@@ -515,7 +515,7 @@
           <w:r>
             <w:fldChar w:fldCharType="separate"/>
           </w:r>
-          <w:hyperlink w:anchor="_Toc236999175" w:history="1">
+          <w:hyperlink w:anchor="_Toc237085406" w:history="1">
             <w:r>
               <w:rPr>
                 <w:rStyle w:val="Hipervnculo"/>
@@ -542,7 +542,7 @@
                 <w:noProof/>
                 <w:webHidden/>
               </w:rPr>
-              <w:instrText xml:space="preserve"> PAGEREF _Toc236999175 \h </w:instrText>
+              <w:instrText xml:space="preserve"> PAGEREF _Toc237085406 \h </w:instrText>
             </w:r>
             <w:r>
               <w:rPr>
@@ -588,7 +588,7 @@
               <w14:ligatures w14:val="standardContextual"/>
             </w:rPr>
           </w:pPr>
-          <w:hyperlink w:anchor="_Toc236999176" w:history="1">
+          <w:hyperlink w:anchor="_Toc237085407" w:history="1">
             <w:r>
               <w:rPr>
                 <w:rStyle w:val="Hipervnculo"/>
@@ -632,7 +632,7 @@
                 <w:noProof/>
                 <w:webHidden/>
               </w:rPr>
-              <w:instrText xml:space="preserve"> PAGEREF _Toc236999176 \h </w:instrText>
+              <w:instrText xml:space="preserve"> PAGEREF _Toc237085407 \h </w:instrText>
             </w:r>
             <w:r>
               <w:rPr>
@@ -678,7 +678,7 @@
               <w14:ligatures w14:val="standardContextual"/>
             </w:rPr>
           </w:pPr>
-          <w:hyperlink w:anchor="_Toc236999177" w:history="1">
+          <w:hyperlink w:anchor="_Toc237085408" w:history="1">
             <w:r>
               <w:rPr>
                 <w:rStyle w:val="Hipervnculo"/>
@@ -722,7 +722,7 @@
                 <w:noProof/>
                 <w:webHidden/>
               </w:rPr>
-              <w:instrText xml:space="preserve"> PAGEREF _Toc236999177 \h </w:instrText>
+              <w:instrText xml:space="preserve"> PAGEREF _Toc237085408 \h </w:instrText>
             </w:r>
             <w:r>
               <w:rPr>
@@ -768,7 +768,7 @@
               <w14:ligatures w14:val="standardContextual"/>
             </w:rPr>
           </w:pPr>
-          <w:hyperlink w:anchor="_Toc236999178" w:history="1">
+          <w:hyperlink w:anchor="_Toc237085409" w:history="1">
             <w:r>
               <w:rPr>
                 <w:rStyle w:val="Hipervnculo"/>
@@ -812,7 +812,7 @@
                 <w:noProof/>
                 <w:webHidden/>
               </w:rPr>
-              <w:instrText xml:space="preserve"> PAGEREF _Toc236999178 \h </w:instrText>
+              <w:instrText xml:space="preserve"> PAGEREF _Toc237085409 \h </w:instrText>
             </w:r>
             <w:r>
               <w:rPr>
@@ -858,7 +858,7 @@
               <w14:ligatures w14:val="standardContextual"/>
             </w:rPr>
           </w:pPr>
-          <w:hyperlink w:anchor="_Toc236999179" w:history="1">
+          <w:hyperlink w:anchor="_Toc237085410" w:history="1">
             <w:r>
               <w:rPr>
                 <w:rStyle w:val="Hipervnculo"/>
@@ -937,7 +937,7 @@
                 <w:noProof/>
                 <w:webHidden/>
               </w:rPr>
-              <w:instrText xml:space="preserve"> PAGEREF _Toc236999179 \h </w:instrText>
+              <w:instrText xml:space="preserve"> PAGEREF _Toc237085410 \h </w:instrText>
             </w:r>
             <w:r>
               <w:rPr>
@@ -983,7 +983,7 @@
               <w14:ligatures w14:val="standardContextual"/>
             </w:rPr>
           </w:pPr>
-          <w:hyperlink w:anchor="_Toc236999180" w:history="1">
+          <w:hyperlink w:anchor="_Toc237085411" w:history="1">
             <w:r>
               <w:rPr>
                 <w:rStyle w:val="Hipervnculo"/>
@@ -1054,7 +1054,7 @@
                 <w:noProof/>
                 <w:webHidden/>
               </w:rPr>
-              <w:instrText xml:space="preserve"> PAGEREF _Toc236999180 \h </w:instrText>
+              <w:instrText xml:space="preserve"> PAGEREF _Toc237085411 \h </w:instrText>
             </w:r>
             <w:r>
               <w:rPr>
@@ -1100,7 +1100,7 @@
               <w14:ligatures w14:val="standardContextual"/>
             </w:rPr>
           </w:pPr>
-          <w:hyperlink w:anchor="_Toc236999181" w:history="1">
+          <w:hyperlink w:anchor="_Toc237085412" w:history="1">
             <w:r>
               <w:rPr>
                 <w:rStyle w:val="Hipervnculo"/>
@@ -1190,7 +1190,7 @@
                 <w:noProof/>
                 <w:webHidden/>
               </w:rPr>
-              <w:instrText xml:space="preserve"> PAGEREF _Toc236999181 \h </w:instrText>
+              <w:instrText xml:space="preserve"> PAGEREF _Toc237085412 \h </w:instrText>
             </w:r>
             <w:r>
               <w:rPr>
@@ -1236,7 +1236,7 @@
               <w14:ligatures w14:val="standardContextual"/>
             </w:rPr>
           </w:pPr>
-          <w:hyperlink w:anchor="_Toc236999182" w:history="1">
+          <w:hyperlink w:anchor="_Toc237085413" w:history="1">
             <w:r>
               <w:rPr>
                 <w:rStyle w:val="Hipervnculo"/>
@@ -1315,7 +1315,7 @@
                 <w:noProof/>
                 <w:webHidden/>
               </w:rPr>
-              <w:instrText xml:space="preserve"> PAGEREF _Toc236999182 \h </w:instrText>
+              <w:instrText xml:space="preserve"> PAGEREF _Toc237085413 \h </w:instrText>
             </w:r>
             <w:r>
               <w:rPr>
@@ -1361,12 +1361,11 @@
               <w14:ligatures w14:val="standardContextual"/>
             </w:rPr>
           </w:pPr>
-          <w:hyperlink w:anchor="_Toc236999183" w:history="1">
+          <w:hyperlink w:anchor="_Toc237085414" w:history="1">
             <w:r>
               <w:rPr>
                 <w:rStyle w:val="Hipervnculo"/>
                 <w:noProof/>
-                <w:highlight w:val="yellow"/>
               </w:rPr>
               <w:t>E.</w:t>
             </w:r>
@@ -1385,7 +1384,6 @@
                 <w:rStyle w:val="Hipervnculo"/>
                 <w:noProof/>
                 <w:w w:val="90"/>
-                <w:highlight w:val="yellow"/>
               </w:rPr>
               <w:t>Ejercicio</w:t>
             </w:r>
@@ -1395,7 +1393,6 @@
                 <w:noProof/>
                 <w:spacing w:val="-7"/>
                 <w:w w:val="90"/>
-                <w:highlight w:val="yellow"/>
               </w:rPr>
               <w:t xml:space="preserve"> </w:t>
             </w:r>
@@ -1404,7 +1401,6 @@
                 <w:rStyle w:val="Hipervnculo"/>
                 <w:noProof/>
                 <w:w w:val="90"/>
-                <w:highlight w:val="yellow"/>
               </w:rPr>
               <w:t>4:</w:t>
             </w:r>
@@ -1414,7 +1410,6 @@
                 <w:noProof/>
                 <w:spacing w:val="-7"/>
                 <w:w w:val="90"/>
-                <w:highlight w:val="yellow"/>
               </w:rPr>
               <w:t xml:space="preserve"> Interfaz vs. Clase Abstracta (El Dilema Real)</w:t>
             </w:r>
@@ -1437,7 +1432,7 @@
                 <w:noProof/>
                 <w:webHidden/>
               </w:rPr>
-              <w:instrText xml:space="preserve"> PAGEREF _Toc236999183 \h </w:instrText>
+              <w:instrText xml:space="preserve"> PAGEREF _Toc237085414 \h </w:instrText>
             </w:r>
             <w:r>
               <w:rPr>
@@ -1483,7 +1478,7 @@
               <w14:ligatures w14:val="standardContextual"/>
             </w:rPr>
           </w:pPr>
-          <w:hyperlink w:anchor="_Toc236999184" w:history="1">
+          <w:hyperlink w:anchor="_Toc237085415" w:history="1">
             <w:r>
               <w:rPr>
                 <w:rStyle w:val="Hipervnculo"/>
@@ -1562,7 +1557,7 @@
                 <w:noProof/>
                 <w:webHidden/>
               </w:rPr>
-              <w:instrText xml:space="preserve"> PAGEREF _Toc236999184 \h </w:instrText>
+              <w:instrText xml:space="preserve"> PAGEREF _Toc237085415 \h </w:instrText>
             </w:r>
             <w:r>
               <w:rPr>
@@ -1608,7 +1603,7 @@
               <w14:ligatures w14:val="standardContextual"/>
             </w:rPr>
           </w:pPr>
-          <w:hyperlink w:anchor="_Toc236999185" w:history="1">
+          <w:hyperlink w:anchor="_Toc237085416" w:history="1">
             <w:r>
               <w:rPr>
                 <w:rStyle w:val="Hipervnculo"/>
@@ -1670,7 +1665,7 @@
                 <w:noProof/>
                 <w:webHidden/>
               </w:rPr>
-              <w:instrText xml:space="preserve"> PAGEREF _Toc236999185 \h </w:instrText>
+              <w:instrText xml:space="preserve"> PAGEREF _Toc237085416 \h </w:instrText>
             </w:r>
             <w:r>
               <w:rPr>
@@ -1715,7 +1710,7 @@
               <w14:ligatures w14:val="standardContextual"/>
             </w:rPr>
           </w:pPr>
-          <w:hyperlink w:anchor="_Toc236999186" w:history="1">
+          <w:hyperlink w:anchor="_Toc237085417" w:history="1">
             <w:r>
               <w:rPr>
                 <w:rStyle w:val="Hipervnculo"/>
@@ -1742,7 +1737,7 @@
                 <w:noProof/>
                 <w:webHidden/>
               </w:rPr>
-              <w:instrText xml:space="preserve"> PAGEREF _Toc236999186 \h </w:instrText>
+              <w:instrText xml:space="preserve"> PAGEREF _Toc237085417 \h </w:instrText>
             </w:r>
             <w:r>
               <w:rPr>
@@ -1787,7 +1782,7 @@
               <w14:ligatures w14:val="standardContextual"/>
             </w:rPr>
           </w:pPr>
-          <w:hyperlink w:anchor="_Toc236999187" w:history="1">
+          <w:hyperlink w:anchor="_Toc237085418" w:history="1">
             <w:r>
               <w:rPr>
                 <w:rStyle w:val="Hipervnculo"/>
@@ -1814,7 +1809,7 @@
                 <w:noProof/>
                 <w:webHidden/>
               </w:rPr>
-              <w:instrText xml:space="preserve"> PAGEREF _Toc236999187 \h </w:instrText>
+              <w:instrText xml:space="preserve"> PAGEREF _Toc237085418 \h </w:instrText>
             </w:r>
             <w:r>
               <w:rPr>
@@ -1876,7 +1871,7 @@
           <w:numId w:val="5"/>
         </w:numPr>
       </w:pPr>
-      <w:bookmarkStart w:id="1" w:name="_Toc236999176"/>
+      <w:bookmarkStart w:id="1" w:name="_Toc237085407"/>
       <w:r>
         <w:lastRenderedPageBreak/>
         <w:t>Forjando Nuevos Caminos</w:t>
@@ -2941,7 +2936,7 @@
         </w:numPr>
       </w:pPr>
       <w:bookmarkStart w:id="2" w:name="_bookmark1"/>
-      <w:bookmarkStart w:id="3" w:name="_Toc236999177"/>
+      <w:bookmarkStart w:id="3" w:name="_Toc237085408"/>
       <w:bookmarkEnd w:id="2"/>
       <w:r>
         <w:t>Prólogo</w:t>
@@ -2970,7 +2965,7 @@
           <w:noProof/>
         </w:rPr>
         <w:drawing>
-          <wp:anchor distT="0" distB="0" distL="114300" distR="114300" simplePos="0" relativeHeight="251662336" behindDoc="0" locked="0" layoutInCell="1" allowOverlap="1" wp14:anchorId="233A80B6" wp14:editId="48E54A4B">
+          <wp:anchor distT="0" distB="0" distL="114300" distR="114300" simplePos="0" relativeHeight="251662336" behindDoc="0" locked="0" layoutInCell="1" allowOverlap="1" wp14:anchorId="233A80B6" wp14:editId="196B68DB">
             <wp:simplePos x="0" y="0"/>
             <wp:positionH relativeFrom="column">
               <wp:posOffset>3371850</wp:posOffset>
@@ -3280,7 +3275,7 @@
         </w:numPr>
       </w:pPr>
       <w:bookmarkStart w:id="4" w:name="_bookmark2"/>
-      <w:bookmarkStart w:id="5" w:name="_Toc236999178"/>
+      <w:bookmarkStart w:id="5" w:name="_Toc237085409"/>
       <w:bookmarkEnd w:id="4"/>
       <w:r>
         <w:lastRenderedPageBreak/>
@@ -4047,7 +4042,7 @@
           </mc:Choice>
           <mc:Fallback>
             <w:pict>
-              <v:group w14:anchorId="7E3F0481" id="Group 15" o:spid="_x0000_s1026" style="width:442.05pt;height:1.6pt;mso-position-horizontal-relative:char;mso-position-vertical-relative:line" coordsize="56140,203" o:gfxdata="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">
+              <v:group w14:anchorId="5360A23E" id="Group 15" o:spid="_x0000_s1026" style="width:442.05pt;height:1.6pt;mso-position-horizontal-relative:char;mso-position-vertical-relative:line" coordsize="56140,203" o:gfxdata="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">
                 <v:shape id="Graphic 16" o:spid="_x0000_s1027" style="position:absolute;width:56127;height:196;visibility:visible;mso-wrap-style:square;v-text-anchor:top" coordsize="5612765,19685" o:gfxdata="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" path="m5612765,l,,,19685r5612765,l5612765,xe" fillcolor="#9f9f9f" stroked="f">
                   <v:path arrowok="t"/>
                 </v:shape>
@@ -4092,7 +4087,7 @@
         </w:numPr>
         <w:jc w:val="left"/>
       </w:pPr>
-      <w:bookmarkStart w:id="7" w:name="_Toc236999179"/>
+      <w:bookmarkStart w:id="7" w:name="_Toc237085410"/>
       <w:r>
         <w:rPr>
           <w:w w:val="90"/>
@@ -5002,7 +4997,7 @@
         <w:jc w:val="left"/>
       </w:pPr>
       <w:bookmarkStart w:id="8" w:name="_bookmark4"/>
-      <w:bookmarkStart w:id="9" w:name="_Toc236999180"/>
+      <w:bookmarkStart w:id="9" w:name="_Toc237085411"/>
       <w:bookmarkEnd w:id="8"/>
       <w:r>
         <w:rPr>
@@ -6016,7 +6011,7 @@
         <w:jc w:val="left"/>
       </w:pPr>
       <w:bookmarkStart w:id="10" w:name="_bookmark5"/>
-      <w:bookmarkStart w:id="11" w:name="_Toc236999181"/>
+      <w:bookmarkStart w:id="11" w:name="_Toc237085412"/>
       <w:bookmarkEnd w:id="10"/>
       <w:r>
         <w:rPr>
@@ -7483,7 +7478,7 @@
         <w:jc w:val="left"/>
       </w:pPr>
       <w:bookmarkStart w:id="12" w:name="_bookmark6"/>
-      <w:bookmarkStart w:id="13" w:name="_Toc236999182"/>
+      <w:bookmarkStart w:id="13" w:name="_Toc237085413"/>
       <w:bookmarkEnd w:id="12"/>
       <w:r>
         <w:rPr>
@@ -8980,17 +8975,13 @@
           <w:numId w:val="6"/>
         </w:numPr>
         <w:jc w:val="left"/>
-        <w:rPr>
-          <w:highlight w:val="yellow"/>
-        </w:rPr>
       </w:pPr>
       <w:bookmarkStart w:id="14" w:name="_bookmark7"/>
-      <w:bookmarkStart w:id="15" w:name="_Toc236999183"/>
+      <w:bookmarkStart w:id="15" w:name="_Toc237085414"/>
       <w:bookmarkEnd w:id="14"/>
       <w:r>
         <w:rPr>
           <w:w w:val="90"/>
-          <w:highlight w:val="yellow"/>
         </w:rPr>
         <w:lastRenderedPageBreak/>
         <w:t>Ejercicio</w:t>
@@ -8999,14 +8990,12 @@
         <w:rPr>
           <w:spacing w:val="-7"/>
           <w:w w:val="90"/>
-          <w:highlight w:val="yellow"/>
         </w:rPr>
         <w:t xml:space="preserve"> </w:t>
       </w:r>
       <w:r>
         <w:rPr>
           <w:w w:val="90"/>
-          <w:highlight w:val="yellow"/>
         </w:rPr>
         <w:t>4:</w:t>
       </w:r>
@@ -9014,7 +9003,6 @@
         <w:rPr>
           <w:spacing w:val="-7"/>
           <w:w w:val="90"/>
-          <w:highlight w:val="yellow"/>
         </w:rPr>
         <w:t xml:space="preserve"> </w:t>
       </w:r>
@@ -9022,7 +9010,6 @@
         <w:rPr>
           <w:spacing w:val="-7"/>
           <w:w w:val="90"/>
-          <w:highlight w:val="yellow"/>
         </w:rPr>
         <w:t>Interfaz vs. Clase Abstracta (El Dilema Real)</w:t>
       </w:r>
@@ -9390,7 +9377,7 @@
         <w:jc w:val="left"/>
       </w:pPr>
       <w:bookmarkStart w:id="16" w:name="_bookmark8"/>
-      <w:bookmarkStart w:id="17" w:name="_Toc236999184"/>
+      <w:bookmarkStart w:id="17" w:name="_Toc237085415"/>
       <w:bookmarkEnd w:id="16"/>
       <w:r>
         <w:rPr>
@@ -9444,9 +9431,6 @@
         </w:rPr>
       </w:pPr>
       <w:r>
-        <w:tab/>
-      </w:r>
-      <w:r>
         <w:rPr>
           <w:b/>
           <w:spacing w:val="-2"/>
@@ -9517,23 +9501,7 @@
           <w:spacing w:val="-2"/>
           <w:szCs w:val="24"/>
         </w:rPr>
-        <w:t xml:space="preserve">Avenger.java, Pilot.java, SamWilson.java (y una clase de prueba con el </w:t>
-      </w:r>
-      <w:proofErr w:type="spellStart"/>
-      <w:r>
-        <w:rPr>
-          <w:spacing w:val="-2"/>
-          <w:szCs w:val="24"/>
-        </w:rPr>
-        <w:t>main</w:t>
-      </w:r>
-      <w:proofErr w:type="spellEnd"/>
-      <w:r>
-        <w:rPr>
-          <w:spacing w:val="-2"/>
-          <w:szCs w:val="24"/>
-        </w:rPr>
-        <w:t>)</w:t>
+        <w:t>Avenger.java, Pilot.java, SamWilson.java</w:t>
       </w:r>
     </w:p>
     <w:p>
@@ -9823,11 +9791,25 @@
         <w:rPr>
           <w:lang w:val="es-ES"/>
         </w:rPr>
-        <w:t>Mientras que la herencia simple (</w:t>
+        <w:t xml:space="preserve">Mientras que la </w:t>
+      </w:r>
+      <w:r>
+        <w:rPr>
+          <w:b/>
+          <w:bCs/>
+          <w:i/>
+          <w:iCs/>
+          <w:lang w:val="es-ES"/>
+        </w:rPr>
+        <w:t>herencia simple (</w:t>
       </w:r>
       <w:proofErr w:type="spellStart"/>
       <w:r>
         <w:rPr>
+          <w:b/>
+          <w:bCs/>
+          <w:i/>
+          <w:iCs/>
           <w:lang w:val="es-ES"/>
         </w:rPr>
         <w:t>extends</w:t>
@@ -9835,9 +9817,113 @@
       <w:proofErr w:type="spellEnd"/>
       <w:r>
         <w:rPr>
-          <w:lang w:val="es-ES"/>
-        </w:rPr>
-        <w:t>) te ata a un único árbol genealógico (un objeto solo puede tener un padre), las interfaces rompen esa cadena. Una clase puede firmar tantos contratos como necesite para describir todas sus capacidades. En este ejercicio verás cómo Sam Wilson combina su identidad como Vengador con su habilidad como Piloto.</w:t>
+          <w:b/>
+          <w:bCs/>
+          <w:i/>
+          <w:iCs/>
+          <w:lang w:val="es-ES"/>
+        </w:rPr>
+        <w:t>)</w:t>
+      </w:r>
+      <w:r>
+        <w:rPr>
+          <w:lang w:val="es-ES"/>
+        </w:rPr>
+        <w:t xml:space="preserve"> te ata a un único árbol genealógico (un objeto solo puede tener un padre), las interfaces rompen esa cadena. Una clase puede firmar tantos contratos como necesite para describir todas sus capacidades. En este ejercicio verás cómo Sam Wilson combina su identidad como Vengador con su habilidad como Piloto.</w:t>
+      </w:r>
+    </w:p>
+    <w:p>
+      <w:pPr>
+        <w:pStyle w:val="Sinespaciado"/>
+        <w:ind w:left="622"/>
+        <w:rPr>
+          <w:lang w:val="es-ES"/>
+        </w:rPr>
+      </w:pPr>
+    </w:p>
+    <w:p>
+      <w:pPr>
+        <w:numPr>
+          <w:ilvl w:val="0"/>
+          <w:numId w:val="34"/>
+        </w:numPr>
+        <w:rPr>
+          <w:spacing w:val="-6"/>
+        </w:rPr>
+      </w:pPr>
+      <w:r>
+        <w:rPr>
+          <w:b/>
+          <w:bCs/>
+          <w:spacing w:val="-6"/>
+        </w:rPr>
+        <w:t>Asegura la interfaz:</w:t>
+      </w:r>
+      <w:r>
+        <w:rPr>
+          <w:spacing w:val="-6"/>
+        </w:rPr>
+        <w:t xml:space="preserve"> Utiliza o adapta la interfaz </w:t>
+      </w:r>
+      <w:proofErr w:type="spellStart"/>
+      <w:r>
+        <w:rPr>
+          <w:b/>
+          <w:bCs/>
+          <w:spacing w:val="-6"/>
+        </w:rPr>
+        <w:t>Avenger</w:t>
+      </w:r>
+      <w:proofErr w:type="spellEnd"/>
+      <w:r>
+        <w:rPr>
+          <w:spacing w:val="-6"/>
+        </w:rPr>
+        <w:t xml:space="preserve"> creada en el ejercicio anterior (asegúrate de que tenga el método </w:t>
+      </w:r>
+      <w:r>
+        <w:rPr>
+          <w:b/>
+          <w:bCs/>
+          <w:i/>
+          <w:iCs/>
+          <w:spacing w:val="-6"/>
+        </w:rPr>
+        <w:t xml:space="preserve">String </w:t>
+      </w:r>
+      <w:proofErr w:type="spellStart"/>
+      <w:proofErr w:type="gramStart"/>
+      <w:r>
+        <w:rPr>
+          <w:b/>
+          <w:bCs/>
+          <w:i/>
+          <w:iCs/>
+          <w:spacing w:val="-6"/>
+        </w:rPr>
+        <w:t>battleCry</w:t>
+      </w:r>
+      <w:proofErr w:type="spellEnd"/>
+      <w:r>
+        <w:rPr>
+          <w:b/>
+          <w:bCs/>
+          <w:i/>
+          <w:iCs/>
+          <w:spacing w:val="-6"/>
+        </w:rPr>
+        <w:t>(</w:t>
+      </w:r>
+      <w:proofErr w:type="gramEnd"/>
+      <w:r>
+        <w:rPr>
+          <w:b/>
+          <w:bCs/>
+          <w:i/>
+          <w:iCs/>
+          <w:spacing w:val="-6"/>
+        </w:rPr>
+        <w:t>)).</w:t>
       </w:r>
     </w:p>
     <w:p>
@@ -9847,50 +9933,17 @@
           <w:ilvl w:val="0"/>
           <w:numId w:val="34"/>
         </w:numPr>
-        <w:tabs>
-          <w:tab w:val="clear" w:pos="720"/>
-          <w:tab w:val="num" w:pos="1342"/>
-        </w:tabs>
-        <w:ind w:left="1342"/>
-      </w:pPr>
-      <w:r>
-        <w:rPr>
-          <w:b/>
-          <w:bCs/>
-        </w:rPr>
-        <w:t xml:space="preserve">Crea la </w:t>
-      </w:r>
-      <w:proofErr w:type="spellStart"/>
-      <w:r>
-        <w:rPr>
-          <w:b/>
-          <w:bCs/>
-        </w:rPr>
-        <w:t>interfaz</w:t>
-      </w:r>
-      <w:proofErr w:type="spellEnd"/>
-      <w:r>
-        <w:rPr>
-          <w:b/>
-          <w:bCs/>
-        </w:rPr>
-        <w:t xml:space="preserve"> </w:t>
-      </w:r>
-      <w:r>
-        <w:rPr>
-          <w:b/>
-          <w:bCs/>
-          <w:i/>
-          <w:iCs/>
-        </w:rPr>
-        <w:t>Avenger</w:t>
-      </w:r>
-      <w:r>
-        <w:rPr>
-          <w:b/>
-          <w:bCs/>
-        </w:rPr>
-        <w:t>:</w:t>
+        <w:rPr>
+          <w:lang w:val="es-ES"/>
+        </w:rPr>
+      </w:pPr>
+      <w:r>
+        <w:rPr>
+          <w:b/>
+          <w:bCs/>
+          <w:lang w:val="es-ES"/>
+        </w:rPr>
+        <w:t>Crea la segunda interfaz Pilot:</w:t>
       </w:r>
     </w:p>
     <w:p>
@@ -9900,20 +9953,29 @@
           <w:ilvl w:val="1"/>
           <w:numId w:val="34"/>
         </w:numPr>
-        <w:tabs>
-          <w:tab w:val="clear" w:pos="1440"/>
-          <w:tab w:val="num" w:pos="2062"/>
-        </w:tabs>
-        <w:ind w:left="2062"/>
-        <w:rPr>
-          <w:lang w:val="es-ES"/>
-        </w:rPr>
-      </w:pPr>
-      <w:r>
-        <w:rPr>
-          <w:lang w:val="es-ES"/>
-        </w:rPr>
-        <w:t xml:space="preserve">Debe declarar el método abstracto String </w:t>
+        <w:rPr>
+          <w:lang w:val="es-ES"/>
+        </w:rPr>
+      </w:pPr>
+      <w:r>
+        <w:rPr>
+          <w:lang w:val="es-ES"/>
+        </w:rPr>
+        <w:t xml:space="preserve">Debe declarar un método </w:t>
+      </w:r>
+      <w:proofErr w:type="spellStart"/>
+      <w:r>
+        <w:rPr>
+          <w:lang w:val="es-ES"/>
+        </w:rPr>
+        <w:t>void</w:t>
+      </w:r>
+      <w:proofErr w:type="spellEnd"/>
+      <w:r>
+        <w:rPr>
+          <w:lang w:val="es-ES"/>
+        </w:rPr>
+        <w:t xml:space="preserve"> </w:t>
       </w:r>
       <w:proofErr w:type="spellStart"/>
       <w:proofErr w:type="gramStart"/>
@@ -9921,7 +9983,7 @@
         <w:rPr>
           <w:lang w:val="es-ES"/>
         </w:rPr>
-        <w:t>battleCry</w:t>
+        <w:t>fly</w:t>
       </w:r>
       <w:proofErr w:type="spellEnd"/>
       <w:r>
@@ -9945,22 +10007,47 @@
           <w:ilvl w:val="0"/>
           <w:numId w:val="34"/>
         </w:numPr>
-        <w:tabs>
-          <w:tab w:val="clear" w:pos="720"/>
-          <w:tab w:val="num" w:pos="1342"/>
-        </w:tabs>
-        <w:ind w:left="1342"/>
-        <w:rPr>
-          <w:lang w:val="es-ES"/>
-        </w:rPr>
-      </w:pPr>
-      <w:r>
-        <w:rPr>
-          <w:b/>
-          <w:bCs/>
-          <w:lang w:val="es-ES"/>
-        </w:rPr>
-        <w:t>Crea la segunda interfaz Pilot:</w:t>
+      </w:pPr>
+      <w:r>
+        <w:rPr>
+          <w:b/>
+          <w:bCs/>
+        </w:rPr>
+        <w:t xml:space="preserve">Crea la </w:t>
+      </w:r>
+      <w:proofErr w:type="spellStart"/>
+      <w:r>
+        <w:rPr>
+          <w:b/>
+          <w:bCs/>
+        </w:rPr>
+        <w:t>clase</w:t>
+      </w:r>
+      <w:proofErr w:type="spellEnd"/>
+      <w:r>
+        <w:rPr>
+          <w:b/>
+          <w:bCs/>
+        </w:rPr>
+        <w:t xml:space="preserve"> </w:t>
+      </w:r>
+      <w:proofErr w:type="spellStart"/>
+      <w:r>
+        <w:rPr>
+          <w:b/>
+          <w:bCs/>
+          <w:i/>
+          <w:iCs/>
+        </w:rPr>
+        <w:t>SamWilson</w:t>
+      </w:r>
+      <w:proofErr w:type="spellEnd"/>
+      <w:r>
+        <w:rPr>
+          <w:b/>
+          <w:bCs/>
+        </w:rPr>
+        <w:t>:</w:t>
       </w:r>
     </w:p>
     <w:p>
@@ -9970,27 +10057,22 @@
           <w:ilvl w:val="1"/>
           <w:numId w:val="34"/>
         </w:numPr>
-        <w:tabs>
-          <w:tab w:val="clear" w:pos="1440"/>
-          <w:tab w:val="num" w:pos="2062"/>
-        </w:tabs>
-        <w:ind w:left="2062"/>
-        <w:rPr>
-          <w:lang w:val="es-ES"/>
-        </w:rPr>
-      </w:pPr>
-      <w:r>
-        <w:rPr>
-          <w:lang w:val="es-ES"/>
-        </w:rPr>
-        <w:t xml:space="preserve">Debe declarar un método </w:t>
+        <w:rPr>
+          <w:lang w:val="es-ES"/>
+        </w:rPr>
+      </w:pPr>
+      <w:r>
+        <w:rPr>
+          <w:lang w:val="es-ES"/>
+        </w:rPr>
+        <w:t xml:space="preserve">Haz que implemente ambas interfaces utilizando una coma para separarlas: </w:t>
       </w:r>
       <w:proofErr w:type="spellStart"/>
       <w:r>
         <w:rPr>
           <w:lang w:val="es-ES"/>
         </w:rPr>
-        <w:t>void</w:t>
+        <w:t>implements</w:t>
       </w:r>
       <w:proofErr w:type="spellEnd"/>
       <w:r>
@@ -9998,6 +10080,38 @@
           <w:lang w:val="es-ES"/>
         </w:rPr>
         <w:t xml:space="preserve"> </w:t>
+      </w:r>
+      <w:proofErr w:type="spellStart"/>
+      <w:r>
+        <w:rPr>
+          <w:lang w:val="es-ES"/>
+        </w:rPr>
+        <w:t>Avenger</w:t>
+      </w:r>
+      <w:proofErr w:type="spellEnd"/>
+      <w:r>
+        <w:rPr>
+          <w:lang w:val="es-ES"/>
+        </w:rPr>
+        <w:t>, Pilot.</w:t>
+      </w:r>
+    </w:p>
+    <w:p>
+      <w:pPr>
+        <w:pStyle w:val="Sinespaciado"/>
+        <w:numPr>
+          <w:ilvl w:val="1"/>
+          <w:numId w:val="34"/>
+        </w:numPr>
+        <w:rPr>
+          <w:lang w:val="es-ES"/>
+        </w:rPr>
+      </w:pPr>
+      <w:r>
+        <w:rPr>
+          <w:lang w:val="es-ES"/>
+        </w:rPr>
+        <w:t xml:space="preserve">Utiliza @Override para programar el método </w:t>
       </w:r>
       <w:proofErr w:type="spellStart"/>
       <w:proofErr w:type="gramStart"/>
@@ -10005,6 +10119,88 @@
         <w:rPr>
           <w:lang w:val="es-ES"/>
         </w:rPr>
+        <w:t>battleCry</w:t>
+      </w:r>
+      <w:proofErr w:type="spellEnd"/>
+      <w:r>
+        <w:rPr>
+          <w:lang w:val="es-ES"/>
+        </w:rPr>
+        <w:t>(</w:t>
+      </w:r>
+      <w:proofErr w:type="gramEnd"/>
+      <w:r>
+        <w:rPr>
+          <w:lang w:val="es-ES"/>
+        </w:rPr>
+        <w:t>), haciendo que retorne el texto: "</w:t>
+      </w:r>
+      <w:proofErr w:type="spellStart"/>
+      <w:r>
+        <w:rPr>
+          <w:lang w:val="es-ES"/>
+        </w:rPr>
+        <w:t>On</w:t>
+      </w:r>
+      <w:proofErr w:type="spellEnd"/>
+      <w:r>
+        <w:rPr>
+          <w:lang w:val="es-ES"/>
+        </w:rPr>
+        <w:t xml:space="preserve"> </w:t>
+      </w:r>
+      <w:proofErr w:type="spellStart"/>
+      <w:r>
+        <w:rPr>
+          <w:lang w:val="es-ES"/>
+        </w:rPr>
+        <w:t>your</w:t>
+      </w:r>
+      <w:proofErr w:type="spellEnd"/>
+      <w:r>
+        <w:rPr>
+          <w:lang w:val="es-ES"/>
+        </w:rPr>
+        <w:t xml:space="preserve"> </w:t>
+      </w:r>
+      <w:proofErr w:type="spellStart"/>
+      <w:r>
+        <w:rPr>
+          <w:lang w:val="es-ES"/>
+        </w:rPr>
+        <w:t>left</w:t>
+      </w:r>
+      <w:proofErr w:type="spellEnd"/>
+      <w:r>
+        <w:rPr>
+          <w:lang w:val="es-ES"/>
+        </w:rPr>
+        <w:t>!".</w:t>
+      </w:r>
+    </w:p>
+    <w:p>
+      <w:pPr>
+        <w:pStyle w:val="Sinespaciado"/>
+        <w:numPr>
+          <w:ilvl w:val="1"/>
+          <w:numId w:val="34"/>
+        </w:numPr>
+        <w:rPr>
+          <w:lang w:val="es-ES"/>
+        </w:rPr>
+      </w:pPr>
+      <w:r>
+        <w:rPr>
+          <w:lang w:val="es-ES"/>
+        </w:rPr>
+        <w:t xml:space="preserve">Utiliza @Override para programar el método </w:t>
+      </w:r>
+      <w:proofErr w:type="spellStart"/>
+      <w:proofErr w:type="gramStart"/>
+      <w:r>
+        <w:rPr>
+          <w:lang w:val="es-ES"/>
+        </w:rPr>
         <w:t>fly</w:t>
       </w:r>
       <w:proofErr w:type="spellEnd"/>
@@ -10019,7 +10215,77 @@
         <w:rPr>
           <w:lang w:val="es-ES"/>
         </w:rPr>
-        <w:t>).</w:t>
+        <w:t xml:space="preserve">), haciendo que imprima por consola exactamente el texto: "Sam Wilson </w:t>
+      </w:r>
+      <w:proofErr w:type="spellStart"/>
+      <w:r>
+        <w:rPr>
+          <w:lang w:val="es-ES"/>
+        </w:rPr>
+        <w:t>is</w:t>
+      </w:r>
+      <w:proofErr w:type="spellEnd"/>
+      <w:r>
+        <w:rPr>
+          <w:lang w:val="es-ES"/>
+        </w:rPr>
+        <w:t xml:space="preserve"> </w:t>
+      </w:r>
+      <w:proofErr w:type="spellStart"/>
+      <w:r>
+        <w:rPr>
+          <w:lang w:val="es-ES"/>
+        </w:rPr>
+        <w:t>flying</w:t>
+      </w:r>
+      <w:proofErr w:type="spellEnd"/>
+      <w:r>
+        <w:rPr>
+          <w:lang w:val="es-ES"/>
+        </w:rPr>
+        <w:t xml:space="preserve"> </w:t>
+      </w:r>
+      <w:proofErr w:type="spellStart"/>
+      <w:r>
+        <w:rPr>
+          <w:lang w:val="es-ES"/>
+        </w:rPr>
+        <w:t>with</w:t>
+      </w:r>
+      <w:proofErr w:type="spellEnd"/>
+      <w:r>
+        <w:rPr>
+          <w:lang w:val="es-ES"/>
+        </w:rPr>
+        <w:t xml:space="preserve"> </w:t>
+      </w:r>
+      <w:proofErr w:type="spellStart"/>
+      <w:r>
+        <w:rPr>
+          <w:lang w:val="es-ES"/>
+        </w:rPr>
+        <w:t>the</w:t>
+      </w:r>
+      <w:proofErr w:type="spellEnd"/>
+      <w:r>
+        <w:rPr>
+          <w:lang w:val="es-ES"/>
+        </w:rPr>
+        <w:t xml:space="preserve"> Falcon </w:t>
+      </w:r>
+      <w:proofErr w:type="spellStart"/>
+      <w:r>
+        <w:rPr>
+          <w:lang w:val="es-ES"/>
+        </w:rPr>
+        <w:t>wings</w:t>
+      </w:r>
+      <w:proofErr w:type="spellEnd"/>
+      <w:r>
+        <w:rPr>
+          <w:lang w:val="es-ES"/>
+        </w:rPr>
+        <w:t>.".</w:t>
       </w:r>
     </w:p>
     <w:p>
@@ -10029,18 +10295,13 @@
           <w:ilvl w:val="0"/>
           <w:numId w:val="34"/>
         </w:numPr>
-        <w:tabs>
-          <w:tab w:val="clear" w:pos="720"/>
-          <w:tab w:val="num" w:pos="1342"/>
-        </w:tabs>
-        <w:ind w:left="1342"/>
-      </w:pPr>
-      <w:r>
-        <w:rPr>
-          <w:b/>
-          <w:bCs/>
-        </w:rPr>
-        <w:t xml:space="preserve">Crea la </w:t>
+      </w:pPr>
+      <w:r>
+        <w:rPr>
+          <w:b/>
+          <w:bCs/>
+        </w:rPr>
+        <w:t xml:space="preserve">Prueba </w:t>
       </w:r>
       <w:proofErr w:type="spellStart"/>
       <w:r>
@@ -10048,7 +10309,7 @@
           <w:b/>
           <w:bCs/>
         </w:rPr>
-        <w:t>clase</w:t>
+        <w:t>tu</w:t>
       </w:r>
       <w:proofErr w:type="spellEnd"/>
       <w:r>
@@ -10063,10 +10324,8 @@
         <w:rPr>
           <w:b/>
           <w:bCs/>
-          <w:i/>
-          <w:iCs/>
-        </w:rPr>
-        <w:t>SamWilson</w:t>
+        </w:rPr>
+        <w:t>código</w:t>
       </w:r>
       <w:proofErr w:type="spellEnd"/>
       <w:r>
@@ -10074,7 +10333,7 @@
           <w:b/>
           <w:bCs/>
         </w:rPr>
-        <w:t>:</w:t>
+        <w:t xml:space="preserve"> (main):</w:t>
       </w:r>
     </w:p>
     <w:p>
@@ -10084,48 +10343,29 @@
           <w:ilvl w:val="1"/>
           <w:numId w:val="34"/>
         </w:numPr>
-        <w:tabs>
-          <w:tab w:val="clear" w:pos="1440"/>
-          <w:tab w:val="num" w:pos="2062"/>
-        </w:tabs>
-        <w:ind w:left="2062"/>
-        <w:rPr>
-          <w:lang w:val="es-ES"/>
-        </w:rPr>
-      </w:pPr>
-      <w:r>
-        <w:rPr>
-          <w:lang w:val="es-ES"/>
-        </w:rPr>
-        <w:t xml:space="preserve">Haz que implemente ambas interfaces utilizando una coma para separarlas: </w:t>
+        <w:rPr>
+          <w:lang w:val="es-ES"/>
+        </w:rPr>
+      </w:pPr>
+      <w:r>
+        <w:rPr>
+          <w:lang w:val="es-ES"/>
+        </w:rPr>
+        <w:t xml:space="preserve">Crea una instancia de </w:t>
       </w:r>
       <w:proofErr w:type="spellStart"/>
       <w:r>
         <w:rPr>
           <w:lang w:val="es-ES"/>
         </w:rPr>
-        <w:t>implements</w:t>
+        <w:t>SamWilson</w:t>
       </w:r>
       <w:proofErr w:type="spellEnd"/>
       <w:r>
         <w:rPr>
           <w:lang w:val="es-ES"/>
         </w:rPr>
-        <w:t xml:space="preserve"> </w:t>
-      </w:r>
-      <w:proofErr w:type="spellStart"/>
-      <w:r>
-        <w:rPr>
-          <w:lang w:val="es-ES"/>
-        </w:rPr>
-        <w:t>Avenger</w:t>
-      </w:r>
-      <w:proofErr w:type="spellEnd"/>
-      <w:r>
-        <w:rPr>
-          <w:lang w:val="es-ES"/>
-        </w:rPr>
-        <w:t>, Pilot.</w:t>
+        <w:t>.</w:t>
       </w:r>
     </w:p>
     <w:p>
@@ -10135,20 +10375,15 @@
           <w:ilvl w:val="1"/>
           <w:numId w:val="34"/>
         </w:numPr>
-        <w:tabs>
-          <w:tab w:val="clear" w:pos="1440"/>
-          <w:tab w:val="num" w:pos="2062"/>
-        </w:tabs>
-        <w:ind w:left="2062"/>
-        <w:rPr>
-          <w:lang w:val="es-ES"/>
-        </w:rPr>
-      </w:pPr>
-      <w:r>
-        <w:rPr>
-          <w:lang w:val="es-ES"/>
-        </w:rPr>
-        <w:t xml:space="preserve">Utiliza @Override para programar el método </w:t>
+        <w:rPr>
+          <w:lang w:val="es-ES"/>
+        </w:rPr>
+      </w:pPr>
+      <w:r>
+        <w:rPr>
+          <w:lang w:val="es-ES"/>
+        </w:rPr>
+        <w:t xml:space="preserve">Invoca su método </w:t>
       </w:r>
       <w:proofErr w:type="spellStart"/>
       <w:proofErr w:type="gramStart"/>
@@ -10170,49 +10405,7 @@
         <w:rPr>
           <w:lang w:val="es-ES"/>
         </w:rPr>
-        <w:t>), haciendo que retorne el texto: "</w:t>
-      </w:r>
-      <w:proofErr w:type="spellStart"/>
-      <w:r>
-        <w:rPr>
-          <w:lang w:val="es-ES"/>
-        </w:rPr>
-        <w:t>On</w:t>
-      </w:r>
-      <w:proofErr w:type="spellEnd"/>
-      <w:r>
-        <w:rPr>
-          <w:lang w:val="es-ES"/>
-        </w:rPr>
-        <w:t xml:space="preserve"> </w:t>
-      </w:r>
-      <w:proofErr w:type="spellStart"/>
-      <w:r>
-        <w:rPr>
-          <w:lang w:val="es-ES"/>
-        </w:rPr>
-        <w:t>your</w:t>
-      </w:r>
-      <w:proofErr w:type="spellEnd"/>
-      <w:r>
-        <w:rPr>
-          <w:lang w:val="es-ES"/>
-        </w:rPr>
-        <w:t xml:space="preserve"> </w:t>
-      </w:r>
-      <w:proofErr w:type="spellStart"/>
-      <w:r>
-        <w:rPr>
-          <w:lang w:val="es-ES"/>
-        </w:rPr>
-        <w:t>left</w:t>
-      </w:r>
-      <w:proofErr w:type="spellEnd"/>
-      <w:r>
-        <w:rPr>
-          <w:lang w:val="es-ES"/>
-        </w:rPr>
-        <w:t>!".</w:t>
+        <w:t>) imprimiendo el resultado por consola con el prefijo correspondiente.</w:t>
       </w:r>
     </w:p>
     <w:p>
@@ -10222,261 +10415,6 @@
           <w:ilvl w:val="1"/>
           <w:numId w:val="34"/>
         </w:numPr>
-        <w:tabs>
-          <w:tab w:val="clear" w:pos="1440"/>
-          <w:tab w:val="num" w:pos="2062"/>
-        </w:tabs>
-        <w:ind w:left="2062"/>
-        <w:rPr>
-          <w:lang w:val="es-ES"/>
-        </w:rPr>
-      </w:pPr>
-      <w:r>
-        <w:rPr>
-          <w:lang w:val="es-ES"/>
-        </w:rPr>
-        <w:t xml:space="preserve">Utiliza @Override para programar el método </w:t>
-      </w:r>
-      <w:proofErr w:type="spellStart"/>
-      <w:proofErr w:type="gramStart"/>
-      <w:r>
-        <w:rPr>
-          <w:lang w:val="es-ES"/>
-        </w:rPr>
-        <w:t>fly</w:t>
-      </w:r>
-      <w:proofErr w:type="spellEnd"/>
-      <w:r>
-        <w:rPr>
-          <w:lang w:val="es-ES"/>
-        </w:rPr>
-        <w:t>(</w:t>
-      </w:r>
-      <w:proofErr w:type="gramEnd"/>
-      <w:r>
-        <w:rPr>
-          <w:lang w:val="es-ES"/>
-        </w:rPr>
-        <w:t xml:space="preserve">), haciendo que imprima por consola exactamente el texto: "Sam Wilson </w:t>
-      </w:r>
-      <w:proofErr w:type="spellStart"/>
-      <w:r>
-        <w:rPr>
-          <w:lang w:val="es-ES"/>
-        </w:rPr>
-        <w:t>is</w:t>
-      </w:r>
-      <w:proofErr w:type="spellEnd"/>
-      <w:r>
-        <w:rPr>
-          <w:lang w:val="es-ES"/>
-        </w:rPr>
-        <w:t xml:space="preserve"> </w:t>
-      </w:r>
-      <w:proofErr w:type="spellStart"/>
-      <w:r>
-        <w:rPr>
-          <w:lang w:val="es-ES"/>
-        </w:rPr>
-        <w:t>flying</w:t>
-      </w:r>
-      <w:proofErr w:type="spellEnd"/>
-      <w:r>
-        <w:rPr>
-          <w:lang w:val="es-ES"/>
-        </w:rPr>
-        <w:t xml:space="preserve"> </w:t>
-      </w:r>
-      <w:proofErr w:type="spellStart"/>
-      <w:r>
-        <w:rPr>
-          <w:lang w:val="es-ES"/>
-        </w:rPr>
-        <w:t>with</w:t>
-      </w:r>
-      <w:proofErr w:type="spellEnd"/>
-      <w:r>
-        <w:rPr>
-          <w:lang w:val="es-ES"/>
-        </w:rPr>
-        <w:t xml:space="preserve"> </w:t>
-      </w:r>
-      <w:proofErr w:type="spellStart"/>
-      <w:r>
-        <w:rPr>
-          <w:lang w:val="es-ES"/>
-        </w:rPr>
-        <w:t>the</w:t>
-      </w:r>
-      <w:proofErr w:type="spellEnd"/>
-      <w:r>
-        <w:rPr>
-          <w:lang w:val="es-ES"/>
-        </w:rPr>
-        <w:t xml:space="preserve"> Falcon </w:t>
-      </w:r>
-      <w:proofErr w:type="spellStart"/>
-      <w:r>
-        <w:rPr>
-          <w:lang w:val="es-ES"/>
-        </w:rPr>
-        <w:t>wings</w:t>
-      </w:r>
-      <w:proofErr w:type="spellEnd"/>
-      <w:r>
-        <w:rPr>
-          <w:lang w:val="es-ES"/>
-        </w:rPr>
-        <w:t>.".</w:t>
-      </w:r>
-    </w:p>
-    <w:p>
-      <w:pPr>
-        <w:pStyle w:val="Sinespaciado"/>
-        <w:numPr>
-          <w:ilvl w:val="0"/>
-          <w:numId w:val="34"/>
-        </w:numPr>
-        <w:tabs>
-          <w:tab w:val="clear" w:pos="720"/>
-          <w:tab w:val="num" w:pos="1342"/>
-        </w:tabs>
-        <w:ind w:left="1342"/>
-      </w:pPr>
-      <w:r>
-        <w:rPr>
-          <w:b/>
-          <w:bCs/>
-        </w:rPr>
-        <w:t xml:space="preserve">Prueba </w:t>
-      </w:r>
-      <w:proofErr w:type="spellStart"/>
-      <w:r>
-        <w:rPr>
-          <w:b/>
-          <w:bCs/>
-        </w:rPr>
-        <w:t>tu</w:t>
-      </w:r>
-      <w:proofErr w:type="spellEnd"/>
-      <w:r>
-        <w:rPr>
-          <w:b/>
-          <w:bCs/>
-        </w:rPr>
-        <w:t xml:space="preserve"> </w:t>
-      </w:r>
-      <w:proofErr w:type="spellStart"/>
-      <w:r>
-        <w:rPr>
-          <w:b/>
-          <w:bCs/>
-        </w:rPr>
-        <w:t>código</w:t>
-      </w:r>
-      <w:proofErr w:type="spellEnd"/>
-      <w:r>
-        <w:rPr>
-          <w:b/>
-          <w:bCs/>
-        </w:rPr>
-        <w:t xml:space="preserve"> (main):</w:t>
-      </w:r>
-    </w:p>
-    <w:p>
-      <w:pPr>
-        <w:pStyle w:val="Sinespaciado"/>
-        <w:numPr>
-          <w:ilvl w:val="1"/>
-          <w:numId w:val="34"/>
-        </w:numPr>
-        <w:tabs>
-          <w:tab w:val="clear" w:pos="1440"/>
-          <w:tab w:val="num" w:pos="2062"/>
-        </w:tabs>
-        <w:ind w:left="2062"/>
-        <w:rPr>
-          <w:lang w:val="es-ES"/>
-        </w:rPr>
-      </w:pPr>
-      <w:r>
-        <w:rPr>
-          <w:lang w:val="es-ES"/>
-        </w:rPr>
-        <w:t xml:space="preserve">Crea una instancia de </w:t>
-      </w:r>
-      <w:proofErr w:type="spellStart"/>
-      <w:r>
-        <w:rPr>
-          <w:lang w:val="es-ES"/>
-        </w:rPr>
-        <w:t>SamWilson</w:t>
-      </w:r>
-      <w:proofErr w:type="spellEnd"/>
-      <w:r>
-        <w:rPr>
-          <w:lang w:val="es-ES"/>
-        </w:rPr>
-        <w:t>.</w:t>
-      </w:r>
-    </w:p>
-    <w:p>
-      <w:pPr>
-        <w:pStyle w:val="Sinespaciado"/>
-        <w:numPr>
-          <w:ilvl w:val="1"/>
-          <w:numId w:val="34"/>
-        </w:numPr>
-        <w:tabs>
-          <w:tab w:val="clear" w:pos="1440"/>
-          <w:tab w:val="num" w:pos="2062"/>
-        </w:tabs>
-        <w:ind w:left="2062"/>
-        <w:rPr>
-          <w:lang w:val="es-ES"/>
-        </w:rPr>
-      </w:pPr>
-      <w:r>
-        <w:rPr>
-          <w:lang w:val="es-ES"/>
-        </w:rPr>
-        <w:t xml:space="preserve">Invoca su método </w:t>
-      </w:r>
-      <w:proofErr w:type="spellStart"/>
-      <w:proofErr w:type="gramStart"/>
-      <w:r>
-        <w:rPr>
-          <w:lang w:val="es-ES"/>
-        </w:rPr>
-        <w:t>battleCry</w:t>
-      </w:r>
-      <w:proofErr w:type="spellEnd"/>
-      <w:r>
-        <w:rPr>
-          <w:lang w:val="es-ES"/>
-        </w:rPr>
-        <w:t>(</w:t>
-      </w:r>
-      <w:proofErr w:type="gramEnd"/>
-      <w:r>
-        <w:rPr>
-          <w:lang w:val="es-ES"/>
-        </w:rPr>
-        <w:t>) imprimiendo el resultado por consola con el prefijo correspondiente.</w:t>
-      </w:r>
-    </w:p>
-    <w:p>
-      <w:pPr>
-        <w:pStyle w:val="Sinespaciado"/>
-        <w:numPr>
-          <w:ilvl w:val="1"/>
-          <w:numId w:val="34"/>
-        </w:numPr>
-        <w:tabs>
-          <w:tab w:val="clear" w:pos="1440"/>
-          <w:tab w:val="num" w:pos="2062"/>
-        </w:tabs>
-        <w:ind w:left="2062"/>
       </w:pPr>
       <w:proofErr w:type="spellStart"/>
       <w:r>
@@ -10735,7 +10673,7 @@
         <w:ind w:left="913" w:right="363" w:hanging="289"/>
         <w:jc w:val="left"/>
       </w:pPr>
-      <w:bookmarkStart w:id="18" w:name="_Toc236999185"/>
+      <w:bookmarkStart w:id="18" w:name="_Toc237085416"/>
       <w:r>
         <w:rPr>
           <w:w w:val="90"/>
@@ -10848,7 +10786,7 @@
           <w:spacing w:val="-2"/>
           <w:szCs w:val="24"/>
         </w:rPr>
-        <w:t>ShieldBearer.java, SteveRogers.java, SamWilson.java, LegacyTest.java</w:t>
+        <w:t>SteveRogers.java, SamWilson.java, LegacyTest.java</w:t>
       </w:r>
     </w:p>
     <w:p>
@@ -11178,39 +11116,13 @@
     <w:p>
       <w:pPr>
         <w:pStyle w:val="Sinespaciado"/>
-        <w:numPr>
-          <w:ilvl w:val="0"/>
-          <w:numId w:val="35"/>
-        </w:numPr>
-        <w:tabs>
-          <w:tab w:val="clear" w:pos="720"/>
-          <w:tab w:val="num" w:pos="1342"/>
-        </w:tabs>
-        <w:ind w:left="1342"/>
+        <w:ind w:left="622"/>
         <w:rPr>
           <w:sz w:val="22"/>
           <w:szCs w:val="22"/>
           <w:lang w:val="es-ES"/>
         </w:rPr>
       </w:pPr>
-      <w:r>
-        <w:rPr>
-          <w:b/>
-          <w:bCs/>
-          <w:sz w:val="22"/>
-          <w:szCs w:val="22"/>
-          <w:lang w:val="es-ES"/>
-        </w:rPr>
-        <w:t>Comportamiento heredado e idéntico:</w:t>
-      </w:r>
-      <w:r>
-        <w:rPr>
-          <w:sz w:val="22"/>
-          <w:szCs w:val="22"/>
-          <w:lang w:val="es-ES"/>
-        </w:rPr>
-        <w:t xml:space="preserve"> Código que ya está escrito en la clase abstracta y que todos los objetos ejecutan exactamente igual (en este caso, levantar el escudo).</w:t>
-      </w:r>
     </w:p>
     <w:p>
       <w:pPr>
@@ -11238,7 +11150,7 @@
           <w:szCs w:val="22"/>
           <w:lang w:val="es-ES"/>
         </w:rPr>
-        <w:t>Comportamiento personalizado y dinámico:</w:t>
+        <w:t>Comportamiento heredado e idéntico:</w:t>
       </w:r>
       <w:r>
         <w:rPr>
@@ -11246,35 +11158,7 @@
           <w:szCs w:val="22"/>
           <w:lang w:val="es-ES"/>
         </w:rPr>
-        <w:t xml:space="preserve"> Un método abstracto que obliga a cada clase hija a reescribirlo a su manera, logrando que una misma llamada (</w:t>
-      </w:r>
-      <w:proofErr w:type="spellStart"/>
-      <w:proofErr w:type="gramStart"/>
-      <w:r>
-        <w:rPr>
-          <w:sz w:val="22"/>
-          <w:szCs w:val="22"/>
-          <w:lang w:val="es-ES"/>
-        </w:rPr>
-        <w:t>motto</w:t>
-      </w:r>
-      <w:proofErr w:type="spellEnd"/>
-      <w:r>
-        <w:rPr>
-          <w:sz w:val="22"/>
-          <w:szCs w:val="22"/>
-          <w:lang w:val="es-ES"/>
-        </w:rPr>
-        <w:t>(</w:t>
-      </w:r>
-      <w:proofErr w:type="gramEnd"/>
-      <w:r>
-        <w:rPr>
-          <w:sz w:val="22"/>
-          <w:szCs w:val="22"/>
-          <w:lang w:val="es-ES"/>
-        </w:rPr>
-        <w:t>)) produzca resultados totalmente diferentes según el objeto que la reciba en ese momento.</w:t>
+        <w:t xml:space="preserve"> Código que ya está escrito en la clase abstracta y que todos los objetos ejecutan exactamente igual (en este caso, levantar el escudo).</w:t>
       </w:r>
     </w:p>
     <w:p>
@@ -11303,6 +11187,123 @@
           <w:szCs w:val="22"/>
           <w:lang w:val="es-ES"/>
         </w:rPr>
+        <w:t>Comportamiento personalizado y dinámico:</w:t>
+      </w:r>
+      <w:r>
+        <w:rPr>
+          <w:sz w:val="22"/>
+          <w:szCs w:val="22"/>
+          <w:lang w:val="es-ES"/>
+        </w:rPr>
+        <w:t xml:space="preserve"> Un </w:t>
+      </w:r>
+      <w:r>
+        <w:rPr>
+          <w:b/>
+          <w:bCs/>
+          <w:i/>
+          <w:iCs/>
+          <w:sz w:val="22"/>
+          <w:szCs w:val="22"/>
+          <w:lang w:val="es-ES"/>
+        </w:rPr>
+        <w:t>método abstracto</w:t>
+      </w:r>
+      <w:r>
+        <w:rPr>
+          <w:sz w:val="22"/>
+          <w:szCs w:val="22"/>
+          <w:lang w:val="es-ES"/>
+        </w:rPr>
+        <w:t xml:space="preserve"> que obliga a cada clase hija a reescribirlo a su manera, logrando que una misma llamada </w:t>
+      </w:r>
+      <w:r>
+        <w:rPr>
+          <w:b/>
+          <w:bCs/>
+          <w:i/>
+          <w:iCs/>
+          <w:sz w:val="22"/>
+          <w:szCs w:val="22"/>
+          <w:lang w:val="es-ES"/>
+        </w:rPr>
+        <w:t>(</w:t>
+      </w:r>
+      <w:proofErr w:type="spellStart"/>
+      <w:proofErr w:type="gramStart"/>
+      <w:r>
+        <w:rPr>
+          <w:b/>
+          <w:bCs/>
+          <w:i/>
+          <w:iCs/>
+          <w:sz w:val="22"/>
+          <w:szCs w:val="22"/>
+          <w:lang w:val="es-ES"/>
+        </w:rPr>
+        <w:t>motto</w:t>
+      </w:r>
+      <w:proofErr w:type="spellEnd"/>
+      <w:r>
+        <w:rPr>
+          <w:b/>
+          <w:bCs/>
+          <w:i/>
+          <w:iCs/>
+          <w:sz w:val="22"/>
+          <w:szCs w:val="22"/>
+          <w:lang w:val="es-ES"/>
+        </w:rPr>
+        <w:t>(</w:t>
+      </w:r>
+      <w:proofErr w:type="gramEnd"/>
+      <w:r>
+        <w:rPr>
+          <w:b/>
+          <w:bCs/>
+          <w:i/>
+          <w:iCs/>
+          <w:sz w:val="22"/>
+          <w:szCs w:val="22"/>
+          <w:lang w:val="es-ES"/>
+        </w:rPr>
+        <w:t xml:space="preserve">)) </w:t>
+      </w:r>
+      <w:r>
+        <w:rPr>
+          <w:sz w:val="22"/>
+          <w:szCs w:val="22"/>
+          <w:lang w:val="es-ES"/>
+        </w:rPr>
+        <w:t>produzca resultados totalmente diferentes según el objeto que la reciba en ese momento.</w:t>
+      </w:r>
+    </w:p>
+    <w:p>
+      <w:pPr>
+        <w:pStyle w:val="Sinespaciado"/>
+        <w:numPr>
+          <w:ilvl w:val="0"/>
+          <w:numId w:val="35"/>
+        </w:numPr>
+        <w:tabs>
+          <w:tab w:val="clear" w:pos="720"/>
+          <w:tab w:val="num" w:pos="1342"/>
+        </w:tabs>
+        <w:ind w:left="1342"/>
+        <w:rPr>
+          <w:sz w:val="22"/>
+          <w:szCs w:val="22"/>
+          <w:lang w:val="es-ES"/>
+        </w:rPr>
+      </w:pPr>
+      <w:r>
+        <w:rPr>
+          <w:b/>
+          <w:bCs/>
+          <w:sz w:val="22"/>
+          <w:szCs w:val="22"/>
+          <w:lang w:val="es-ES"/>
+        </w:rPr>
         <w:t xml:space="preserve">Asegura la clase abstracta </w:t>
       </w:r>
       <w:proofErr w:type="spellStart"/>
@@ -11899,6 +11900,10 @@
       <w:proofErr w:type="spellStart"/>
       <w:r>
         <w:rPr>
+          <w:b/>
+          <w:bCs/>
+          <w:i/>
+          <w:iCs/>
           <w:sz w:val="22"/>
           <w:szCs w:val="22"/>
         </w:rPr>
@@ -12590,7 +12595,7 @@
                                 <w:sz w:val="18"/>
                                 <w:szCs w:val="18"/>
                               </w:rPr>
-                              <w:t>Steve Rogers' motto: I can do this all day.</w:t>
+                              <w:t>I can do this all day.</w:t>
                             </w:r>
                           </w:p>
                           <w:p>
@@ -12626,7 +12631,7 @@
                                 <w:sz w:val="18"/>
                                 <w:szCs w:val="18"/>
                               </w:rPr>
-                              <w:t>Sam Wilson's motto: The shield doesn't belong to a man. It belongs to an idea.</w:t>
+                              <w:t>The shield doesn't belong to a man. It belongs to an idea.</w:t>
                             </w:r>
                           </w:p>
                         </w:txbxContent>
@@ -12687,7 +12692,7 @@
                           <w:sz w:val="18"/>
                           <w:szCs w:val="18"/>
                         </w:rPr>
-                        <w:t>Steve Rogers' motto: I can do this all day.</w:t>
+                        <w:t>I can do this all day.</w:t>
                       </w:r>
                     </w:p>
                     <w:p>
@@ -12723,7 +12728,7 @@
                           <w:sz w:val="18"/>
                           <w:szCs w:val="18"/>
                         </w:rPr>
-                        <w:t>Sam Wilson's motto: The shield doesn't belong to a man. It belongs to an idea.</w:t>
+                        <w:t>The shield doesn't belong to a man. It belongs to an idea.</w:t>
                       </w:r>
                     </w:p>
                   </w:txbxContent>
@@ -12768,7 +12773,7 @@
       </w:pPr>
       <w:bookmarkStart w:id="19" w:name="_bookmark9"/>
       <w:bookmarkStart w:id="20" w:name="_Toc234568067"/>
-      <w:bookmarkStart w:id="21" w:name="_Toc236999186"/>
+      <w:bookmarkStart w:id="21" w:name="_Toc237085417"/>
       <w:bookmarkEnd w:id="19"/>
       <w:r>
         <w:lastRenderedPageBreak/>
@@ -16270,7 +16275,7 @@
         <w:ind w:left="0" w:firstLine="622"/>
       </w:pPr>
       <w:bookmarkStart w:id="22" w:name="_bookmark11"/>
-      <w:bookmarkStart w:id="23" w:name="_Toc236999187"/>
+      <w:bookmarkStart w:id="23" w:name="_Toc237085418"/>
       <w:bookmarkEnd w:id="22"/>
       <w:r>
         <w:lastRenderedPageBreak/>
@@ -17430,7 +17435,7 @@
         </mc:Choice>
         <mc:Fallback>
           <w:pict>
-            <v:shape w14:anchorId="2ED170D8" id="Graphic 4" o:spid="_x0000_s1026" style="position:absolute;margin-left:86.45pt;margin-top:719.75pt;width:476.5pt;height:25.2pt;z-index:-251659264;visibility:visible;mso-wrap-style:square;mso-wrap-distance-left:0;mso-wrap-distance-top:0;mso-wrap-distance-right:0;mso-wrap-distance-bottom:0;mso-position-horizontal:absolute;mso-position-horizontal-relative:page;mso-position-vertical:absolute;mso-position-vertical-relative:page;v-text-anchor:top" coordsize="6051550,320040" o:gfxdata="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" path="m6051397,l5594197,,,12,,18605r5594197,l5594197,320040r457200,l6051397,xe" fillcolor="black" stroked="f">
+            <v:shape w14:anchorId="66F65C0A" id="Graphic 4" o:spid="_x0000_s1026" style="position:absolute;margin-left:86.45pt;margin-top:719.75pt;width:476.5pt;height:25.2pt;z-index:-251659264;visibility:visible;mso-wrap-style:square;mso-wrap-distance-left:0;mso-wrap-distance-top:0;mso-wrap-distance-right:0;mso-wrap-distance-bottom:0;mso-position-horizontal:absolute;mso-position-horizontal-relative:page;mso-position-vertical:absolute;mso-position-vertical-relative:page;v-text-anchor:top" coordsize="6051550,320040" o:gfxdata="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" path="m6051397,l5594197,,,12,,18605r5594197,l5594197,320040r457200,l6051397,xe" fillcolor="black" stroked="f">
               <v:path arrowok="t"/>
               <w10:wrap anchorx="page" anchory="page"/>
             </v:shape>
@@ -19958,9 +19963,9 @@
       <w:lvlJc w:val="left"/>
       <w:pPr>
         <w:tabs>
-          <w:tab w:val="num" w:pos="720"/>
-        </w:tabs>
-        <w:ind w:left="720" w:hanging="360"/>
+          <w:tab w:val="num" w:pos="1342"/>
+        </w:tabs>
+        <w:ind w:left="1342" w:hanging="360"/>
       </w:pPr>
     </w:lvl>
     <w:lvl w:ilvl="1">
@@ -19970,9 +19975,9 @@
       <w:lvlJc w:val="left"/>
       <w:pPr>
         <w:tabs>
-          <w:tab w:val="num" w:pos="1440"/>
-        </w:tabs>
-        <w:ind w:left="1440" w:hanging="360"/>
+          <w:tab w:val="num" w:pos="2062"/>
+        </w:tabs>
+        <w:ind w:left="2062" w:hanging="360"/>
       </w:pPr>
       <w:rPr>
         <w:rFonts w:ascii="Courier New" w:hAnsi="Courier New" w:hint="default"/>
@@ -19986,9 +19991,9 @@
       <w:lvlJc w:val="left"/>
       <w:pPr>
         <w:tabs>
-          <w:tab w:val="num" w:pos="2160"/>
-        </w:tabs>
-        <w:ind w:left="2160" w:hanging="360"/>
+          <w:tab w:val="num" w:pos="2782"/>
+        </w:tabs>
+        <w:ind w:left="2782" w:hanging="360"/>
       </w:pPr>
     </w:lvl>
     <w:lvl w:ilvl="3" w:tentative="1">
@@ -19998,9 +20003,9 @@
       <w:lvlJc w:val="left"/>
       <w:pPr>
         <w:tabs>
-          <w:tab w:val="num" w:pos="2880"/>
-        </w:tabs>
-        <w:ind w:left="2880" w:hanging="360"/>
+          <w:tab w:val="num" w:pos="3502"/>
+        </w:tabs>
+        <w:ind w:left="3502" w:hanging="360"/>
       </w:pPr>
     </w:lvl>
     <w:lvl w:ilvl="4" w:tentative="1">
@@ -20010,9 +20015,9 @@
       <w:lvlJc w:val="left"/>
       <w:pPr>
         <w:tabs>
-          <w:tab w:val="num" w:pos="3600"/>
-        </w:tabs>
-        <w:ind w:left="3600" w:hanging="360"/>
+          <w:tab w:val="num" w:pos="4222"/>
+        </w:tabs>
+        <w:ind w:left="4222" w:hanging="360"/>
       </w:pPr>
     </w:lvl>
     <w:lvl w:ilvl="5" w:tentative="1">
@@ -20022,9 +20027,9 @@
       <w:lvlJc w:val="left"/>
       <w:pPr>
         <w:tabs>
-          <w:tab w:val="num" w:pos="4320"/>
-        </w:tabs>
-        <w:ind w:left="4320" w:hanging="360"/>
+          <w:tab w:val="num" w:pos="4942"/>
+        </w:tabs>
+        <w:ind w:left="4942" w:hanging="360"/>
       </w:pPr>
     </w:lvl>
     <w:lvl w:ilvl="6" w:tentative="1">
@@ -20034,9 +20039,9 @@
       <w:lvlJc w:val="left"/>
       <w:pPr>
         <w:tabs>
-          <w:tab w:val="num" w:pos="5040"/>
-        </w:tabs>
-        <w:ind w:left="5040" w:hanging="360"/>
+          <w:tab w:val="num" w:pos="5662"/>
+        </w:tabs>
+        <w:ind w:left="5662" w:hanging="360"/>
       </w:pPr>
     </w:lvl>
     <w:lvl w:ilvl="7" w:tentative="1">
@@ -20046,9 +20051,9 @@
       <w:lvlJc w:val="left"/>
       <w:pPr>
         <w:tabs>
-          <w:tab w:val="num" w:pos="5760"/>
-        </w:tabs>
-        <w:ind w:left="5760" w:hanging="360"/>
+          <w:tab w:val="num" w:pos="6382"/>
+        </w:tabs>
+        <w:ind w:left="6382" w:hanging="360"/>
       </w:pPr>
     </w:lvl>
     <w:lvl w:ilvl="8" w:tentative="1">
@@ -20058,9 +20063,9 @@
       <w:lvlJc w:val="left"/>
       <w:pPr>
         <w:tabs>
-          <w:tab w:val="num" w:pos="6480"/>
-        </w:tabs>
-        <w:ind w:left="6480" w:hanging="360"/>
+          <w:tab w:val="num" w:pos="7102"/>
+        </w:tabs>
+        <w:ind w:left="7102" w:hanging="360"/>
       </w:pPr>
     </w:lvl>
   </w:abstractNum>
@@ -22740,7 +22745,7 @@
   <w:style w:type="paragraph" w:default="1" w:styleId="Normal">
     <w:name w:val="Normal"/>
     <w:qFormat/>
-    <w:rsid w:val="00685A7B"/>
+    <w:rsid w:val="00E6675D"/>
     <w:rPr>
       <w:rFonts w:ascii="Aptos" w:eastAsia="Trebuchet MS" w:hAnsi="Aptos" w:cs="Trebuchet MS"/>
       <w:sz w:val="24"/>
@@ -22846,6 +22851,7 @@
   <w:style w:type="character" w:default="1" w:styleId="Fuentedeprrafopredeter">
     <w:name w:val="Default Paragraph Font"/>
     <w:uiPriority w:val="1"/>
+    <w:semiHidden/>
     <w:unhideWhenUsed/>
   </w:style>
   <w:style w:type="table" w:default="1" w:styleId="Tablanormal">

</xml_diff>